<commit_message>
Update diario W22 - 2026-05-31
</commit_message>
<xml_diff>
--- a/diario-cybersecurity-2026.docx
+++ b/diario-cybersecurity-2026.docx
@@ -111,6 +111,22 @@
       <w:pPr>
         <w:spacing w:after="60" w:before="120"/>
       </w:pPr>
+      <w:hyperlink w:history="1" w:anchor="bm_w22">
+        <w:r>
+          <w:rPr>
+            <w:rStyle w:val="Hyperlink"/>
+            <w:rFonts w:ascii="Calibri" w:cs="Calibri" w:eastAsia="Calibri" w:hAnsi="Calibri"/>
+            <w:sz w:val="22"/>
+            <w:szCs w:val="22"/>
+          </w:rPr>
+          <w:t xml:space="preserve">W22 · 31 maggio 2026 — Databricks Lakewatch · ManageEngine Log360 SOAR · Forescout OT/IoT</w:t>
+        </w:r>
+      </w:hyperlink>
+    </w:p>
+    <w:p>
+      <w:pPr>
+        <w:spacing w:after="60" w:before="120"/>
+      </w:pPr>
       <w:hyperlink w:history="1" w:anchor="bm_w21_24mag">
         <w:r>
           <w:rPr>
@@ -138,6 +154,1410 @@
           <w:t xml:space="preserve">W21 · 21 maggio 2026 — Idira (PANW) · Sysdig Headless Cloud Security · Dragos Platform 3.1</w:t>
         </w:r>
       </w:hyperlink>
+    </w:p>
+    <w:p>
+      <w:r>
+        <w:br w:type="page"/>
+      </w:r>
+    </w:p>
+    <w:p>
+      <w:pPr>
+        <w:pStyle w:val="Heading1"/>
+      </w:pPr>
+      <w:bookmarkStart w:name="bm_w22" w:id="200"/>
+      <w:r>
+        <w:rPr>
+          <w:rFonts w:ascii="Calibri" w:cs="Calibri" w:eastAsia="Calibri" w:hAnsi="Calibri"/>
+          <w:b/>
+          <w:bCs/>
+          <w:color w:val="1F4E79"/>
+          <w:sz w:val="28"/>
+          <w:szCs w:val="28"/>
+        </w:rPr>
+        <w:t xml:space="preserve">W22 · 31 maggio 2026</w:t>
+      </w:r>
+      <w:bookmarkEnd w:id="200"/>
+    </w:p>
+    <w:tbl>
+      <w:tblPr>
+        <w:tblW w:type="dxa" w:w="9026"/>
+        <w:tblBorders>
+          <w:top w:val="single" w:color="auto" w:sz="4"/>
+          <w:left w:val="single" w:color="auto" w:sz="4"/>
+          <w:bottom w:val="single" w:color="auto" w:sz="4"/>
+          <w:right w:val="single" w:color="auto" w:sz="4"/>
+          <w:insideH w:val="single" w:color="auto" w:sz="4"/>
+          <w:insideV w:val="single" w:color="auto" w:sz="4"/>
+        </w:tblBorders>
+      </w:tblPr>
+      <w:tblGrid>
+        <w:gridCol w:w="2252"/>
+        <w:gridCol w:w="2252"/>
+        <w:gridCol w:w="2251"/>
+        <w:gridCol w:w="2271"/>
+      </w:tblGrid>
+      <w:tr>
+        <w:tc>
+          <w:tcPr>
+            <w:tcW w:type="dxa" w:w="2252"/>
+            <w:tcBorders>
+              <w:top w:val="single" w:color="C9C9C9" w:sz="1"/>
+              <w:left w:val="single" w:color="C9C9C9" w:sz="1"/>
+              <w:bottom w:val="single" w:color="C9C9C9" w:sz="1"/>
+              <w:right w:val="single" w:color="C9C9C9" w:sz="1"/>
+            </w:tcBorders>
+            <w:shd w:fill="DEEAF1" w:val="clear"/>
+            <w:tcMar>
+              <w:top w:type="dxa" w:w="80"/>
+              <w:left w:type="dxa" w:w="120"/>
+              <w:bottom w:type="dxa" w:w="80"/>
+              <w:right w:type="dxa" w:w="120"/>
+            </w:tcMar>
+          </w:tcPr>
+          <w:p>
+            <w:r>
+              <w:rPr>
+                <w:rFonts w:ascii="Calibri" w:cs="Calibri" w:eastAsia="Calibri" w:hAnsi="Calibri"/>
+                <w:b/>
+                <w:color w:val="1F4E79"/>
+                <w:sz w:val="20"/>
+              </w:rPr>
+              <w:t>Data</w:t>
+            </w:r>
+          </w:p>
+          <w:p>
+            <w:r>
+              <w:rPr>
+                <w:rFonts w:ascii="Calibri" w:cs="Calibri" w:eastAsia="Calibri" w:hAnsi="Calibri"/>
+                <w:sz w:val="20"/>
+              </w:rPr>
+              <w:t>31 maggio 2026</w:t>
+            </w:r>
+          </w:p>
+        </w:tc>
+        <w:tc>
+          <w:tcPr>
+            <w:tcW w:type="dxa" w:w="2252"/>
+            <w:tcBorders>
+              <w:top w:val="single" w:color="C9C9C9" w:sz="1"/>
+              <w:left w:val="single" w:color="C9C9C9" w:sz="1"/>
+              <w:bottom w:val="single" w:color="C9C9C9" w:sz="1"/>
+              <w:right w:val="single" w:color="C9C9C9" w:sz="1"/>
+            </w:tcBorders>
+            <w:shd w:fill="DEEAF1" w:val="clear"/>
+            <w:tcMar>
+              <w:top w:type="dxa" w:w="80"/>
+              <w:left w:type="dxa" w:w="120"/>
+              <w:bottom w:type="dxa" w:w="80"/>
+              <w:right w:type="dxa" w:w="120"/>
+            </w:tcMar>
+          </w:tcPr>
+          <w:p>
+            <w:r>
+              <w:rPr>
+                <w:rFonts w:ascii="Calibri" w:cs="Calibri" w:eastAsia="Calibri" w:hAnsi="Calibri"/>
+                <w:b/>
+                <w:color w:val="1F4E79"/>
+                <w:sz w:val="20"/>
+              </w:rPr>
+              <w:t>Settimana</w:t>
+            </w:r>
+          </w:p>
+          <w:p>
+            <w:r>
+              <w:rPr>
+                <w:rFonts w:ascii="Calibri" w:cs="Calibri" w:eastAsia="Calibri" w:hAnsi="Calibri"/>
+                <w:sz w:val="20"/>
+              </w:rPr>
+              <w:t>W22 2026</w:t>
+            </w:r>
+          </w:p>
+        </w:tc>
+        <w:tc>
+          <w:tcPr>
+            <w:tcW w:type="dxa" w:w="2251"/>
+            <w:tcBorders>
+              <w:top w:val="single" w:color="C9C9C9" w:sz="1"/>
+              <w:left w:val="single" w:color="C9C9C9" w:sz="1"/>
+              <w:bottom w:val="single" w:color="C9C9C9" w:sz="1"/>
+              <w:right w:val="single" w:color="C9C9C9" w:sz="1"/>
+            </w:tcBorders>
+            <w:shd w:fill="DEEAF1" w:val="clear"/>
+            <w:tcMar>
+              <w:top w:type="dxa" w:w="80"/>
+              <w:left w:type="dxa" w:w="120"/>
+              <w:bottom w:type="dxa" w:w="80"/>
+              <w:right w:type="dxa" w:w="120"/>
+            </w:tcMar>
+          </w:tcPr>
+          <w:p>
+            <w:r>
+              <w:rPr>
+                <w:rFonts w:ascii="Calibri" w:cs="Calibri" w:eastAsia="Calibri" w:hAnsi="Calibri"/>
+                <w:b/>
+                <w:color w:val="1F4E79"/>
+                <w:sz w:val="20"/>
+              </w:rPr>
+              <w:t>Ambiti</w:t>
+            </w:r>
+          </w:p>
+          <w:p>
+            <w:r>
+              <w:rPr>
+                <w:rFonts w:ascii="Calibri" w:cs="Calibri" w:eastAsia="Calibri" w:hAnsi="Calibri"/>
+                <w:sz w:val="20"/>
+              </w:rPr>
+              <w:t>AI/SIEM · OT/IoT · Network</w:t>
+            </w:r>
+          </w:p>
+        </w:tc>
+        <w:tc>
+          <w:tcPr>
+            <w:tcW w:type="dxa" w:w="2271"/>
+            <w:tcBorders>
+              <w:top w:val="single" w:color="C9C9C9" w:sz="1"/>
+              <w:left w:val="single" w:color="C9C9C9" w:sz="1"/>
+              <w:bottom w:val="single" w:color="C9C9C9" w:sz="1"/>
+              <w:right w:val="single" w:color="C9C9C9" w:sz="1"/>
+            </w:tcBorders>
+            <w:shd w:fill="DEEAF1" w:val="clear"/>
+            <w:tcMar>
+              <w:top w:type="dxa" w:w="80"/>
+              <w:left w:type="dxa" w:w="120"/>
+              <w:bottom w:type="dxa" w:w="80"/>
+              <w:right w:type="dxa" w:w="120"/>
+            </w:tcMar>
+          </w:tcPr>
+          <w:p>
+            <w:r>
+              <w:rPr>
+                <w:rFonts w:ascii="Calibri" w:cs="Calibri" w:eastAsia="Calibri" w:hAnsi="Calibri"/>
+                <w:b/>
+                <w:color w:val="1F4E79"/>
+                <w:sz w:val="20"/>
+              </w:rPr>
+              <w:t>Target</w:t>
+            </w:r>
+          </w:p>
+          <w:p>
+            <w:r>
+              <w:rPr>
+                <w:rFonts w:ascii="Calibri" w:cs="Calibri" w:eastAsia="Calibri" w:hAnsi="Calibri"/>
+                <w:sz w:val="20"/>
+              </w:rPr>
+              <w:t>Enterprise · Mid-market · PA Centrale</w:t>
+            </w:r>
+          </w:p>
+        </w:tc>
+      </w:tr>
+    </w:tbl>
+    <w:p>
+      <w:pPr>
+        <w:spacing w:after="120" w:before="240"/>
+      </w:pPr>
+    </w:p>
+    <w:p>
+      <w:pPr>
+        <w:pStyle w:val="Heading2"/>
+      </w:pPr>
+      <w:r>
+        <w:rPr>
+          <w:rFonts w:ascii="Calibri" w:cs="Calibri" w:eastAsia="Calibri" w:hAnsi="Calibri"/>
+          <w:b/>
+          <w:color w:val="1F4E79"/>
+          <w:sz w:val="24"/>
+        </w:rPr>
+        <w:t>1. Databricks Lakewatch — SIEM Open Agentico</w:t>
+      </w:r>
+    </w:p>
+    <w:tbl>
+      <w:tblPr>
+        <w:tblW w:type="dxa" w:w="9026"/>
+        <w:tblBorders>
+          <w:top w:val="single" w:color="C9C9C9" w:sz="1"/>
+          <w:left w:val="single" w:color="C9C9C9" w:sz="1"/>
+          <w:bottom w:val="single" w:color="C9C9C9" w:sz="1"/>
+          <w:right w:val="single" w:color="C9C9C9" w:sz="1"/>
+          <w:insideH w:val="single" w:color="C9C9C9" w:sz="1"/>
+          <w:insideV w:val="single" w:color="C9C9C9" w:sz="1"/>
+        </w:tblBorders>
+      </w:tblPr>
+      <w:tblGrid>
+        <w:gridCol w:w="2000"/>
+        <w:gridCol w:w="7026"/>
+      </w:tblGrid>
+      <w:tr>
+        <w:tc>
+          <w:tcPr>
+            <w:tcW w:type="dxa" w:w="2000"/>
+            <w:shd w:fill="1F4E79" w:val="clear"/>
+            <w:tcMar>
+              <w:top w:type="dxa" w:w="80"/>
+              <w:left w:type="dxa" w:w="120"/>
+              <w:bottom w:type="dxa" w:w="80"/>
+              <w:right w:type="dxa" w:w="120"/>
+            </w:tcMar>
+          </w:tcPr>
+          <w:p>
+            <w:r>
+              <w:rPr>
+                <w:rFonts w:ascii="Calibri" w:cs="Calibri" w:hAnsi="Calibri"/>
+                <w:b/>
+                <w:color w:val="FFFFFF"/>
+                <w:sz w:val="20"/>
+              </w:rPr>
+              <w:t>Vendor</w:t>
+            </w:r>
+          </w:p>
+        </w:tc>
+        <w:tc>
+          <w:tcPr>
+            <w:tcW w:type="dxa" w:w="7026"/>
+            <w:shd w:fill="DEEAF1" w:val="clear"/>
+            <w:tcMar>
+              <w:top w:type="dxa" w:w="80"/>
+              <w:left w:type="dxa" w:w="120"/>
+              <w:bottom w:type="dxa" w:w="80"/>
+              <w:right w:type="dxa" w:w="120"/>
+            </w:tcMar>
+          </w:tcPr>
+          <w:p>
+            <w:r>
+              <w:rPr>
+                <w:rFonts w:ascii="Calibri" w:cs="Calibri" w:hAnsi="Calibri"/>
+                <w:sz w:val="20"/>
+              </w:rPr>
+              <w:t>Databricks (USA) · Annuncio: 24 marzo 2026, Private Preview</w:t>
+            </w:r>
+          </w:p>
+        </w:tc>
+      </w:tr>
+      <w:tr>
+        <w:tc>
+          <w:tcPr>
+            <w:tcW w:type="dxa" w:w="2000"/>
+            <w:shd w:fill="1F4E79" w:val="clear"/>
+            <w:tcMar>
+              <w:top w:type="dxa" w:w="80"/>
+              <w:left w:type="dxa" w:w="120"/>
+              <w:bottom w:type="dxa" w:w="80"/>
+              <w:right w:type="dxa" w:w="120"/>
+            </w:tcMar>
+          </w:tcPr>
+          <w:p>
+            <w:r>
+              <w:rPr>
+                <w:rFonts w:ascii="Calibri" w:cs="Calibri" w:hAnsi="Calibri"/>
+                <w:b/>
+                <w:color w:val="FFFFFF"/>
+                <w:sz w:val="20"/>
+              </w:rPr>
+              <w:t>Ambito</w:t>
+            </w:r>
+          </w:p>
+        </w:tc>
+        <w:tc>
+          <w:tcPr>
+            <w:tcW w:type="dxa" w:w="7026"/>
+            <w:shd w:fill="FFFFFF" w:val="clear"/>
+            <w:tcMar>
+              <w:top w:type="dxa" w:w="80"/>
+              <w:left w:type="dxa" w:w="120"/>
+              <w:bottom w:type="dxa" w:w="80"/>
+              <w:right w:type="dxa" w:w="120"/>
+            </w:tcMar>
+          </w:tcPr>
+          <w:p>
+            <w:r>
+              <w:rPr>
+                <w:rFonts w:ascii="Calibri" w:cs="Calibri" w:hAnsi="Calibri"/>
+                <w:sz w:val="20"/>
+              </w:rPr>
+              <w:t>AI &amp; Threat Intelligence / SIEM next-gen</w:t>
+            </w:r>
+          </w:p>
+        </w:tc>
+      </w:tr>
+      <w:tr>
+        <w:tc>
+          <w:tcPr>
+            <w:tcW w:type="dxa" w:w="2000"/>
+            <w:shd w:fill="1F4E79" w:val="clear"/>
+            <w:tcMar>
+              <w:top w:type="dxa" w:w="80"/>
+              <w:left w:type="dxa" w:w="120"/>
+              <w:bottom w:type="dxa" w:w="80"/>
+              <w:right w:type="dxa" w:w="120"/>
+            </w:tcMar>
+          </w:tcPr>
+          <w:p>
+            <w:r>
+              <w:rPr>
+                <w:rFonts w:ascii="Calibri" w:cs="Calibri" w:hAnsi="Calibri"/>
+                <w:b/>
+                <w:color w:val="FFFFFF"/>
+                <w:sz w:val="20"/>
+              </w:rPr>
+              <w:t>Cosa fa</w:t>
+            </w:r>
+          </w:p>
+        </w:tc>
+        <w:tc>
+          <w:tcPr>
+            <w:tcW w:type="dxa" w:w="7026"/>
+            <w:shd w:fill="DEEAF1" w:val="clear"/>
+            <w:tcMar>
+              <w:top w:type="dxa" w:w="80"/>
+              <w:left w:type="dxa" w:w="120"/>
+              <w:bottom w:type="dxa" w:w="80"/>
+              <w:right w:type="dxa" w:w="120"/>
+            </w:tcMar>
+          </w:tcPr>
+          <w:p>
+            <w:r>
+              <w:rPr>
+                <w:rFonts w:ascii="Calibri" w:cs="Calibri" w:hAnsi="Calibri"/>
+                <w:sz w:val="20"/>
+              </w:rPr>
+              <w:t xml:space="preserve">SIEM di nuova generazione basato su lakehouse. Unifica dati sicurezza, IT e business per rilevamento minacce a scala petabyte con agenti AI personalizzabili. TCO dichiarato -80% vs SIEM legacy. Powered by Anthropic Claude per correlazione cross-domain.</w:t>
+            </w:r>
+          </w:p>
+        </w:tc>
+      </w:tr>
+      <w:tr>
+        <w:tc>
+          <w:tcPr>
+            <w:tcW w:type="dxa" w:w="2000"/>
+            <w:shd w:fill="1F4E79" w:val="clear"/>
+            <w:tcMar>
+              <w:top w:type="dxa" w:w="80"/>
+              <w:left w:type="dxa" w:w="120"/>
+              <w:bottom w:type="dxa" w:w="80"/>
+              <w:right w:type="dxa" w:w="120"/>
+            </w:tcMar>
+          </w:tcPr>
+          <w:p>
+            <w:r>
+              <w:rPr>
+                <w:rFonts w:ascii="Calibri" w:cs="Calibri" w:hAnsi="Calibri"/>
+                <w:b/>
+                <w:color w:val="FFFFFF"/>
+                <w:sz w:val="20"/>
+              </w:rPr>
+              <w:t>Infrastruttura</w:t>
+            </w:r>
+          </w:p>
+        </w:tc>
+        <w:tc>
+          <w:tcPr>
+            <w:tcW w:type="dxa" w:w="7026"/>
+            <w:shd w:fill="FFFFFF" w:val="clear"/>
+            <w:tcMar>
+              <w:top w:type="dxa" w:w="80"/>
+              <w:left w:type="dxa" w:w="120"/>
+              <w:bottom w:type="dxa" w:w="80"/>
+              <w:right w:type="dxa" w:w="120"/>
+            </w:tcMar>
+          </w:tcPr>
+          <w:p>
+            <w:r>
+              <w:rPr>
+                <w:rFonts w:ascii="Calibri" w:cs="Calibri" w:hAnsi="Calibri"/>
+                <w:sz w:val="20"/>
+              </w:rPr>
+              <w:t xml:space="preserve">Cloud-native SaaS su Databricks Unity Catalog. Architettura Delta Lake + AI. Open OCSF, no vendor lock-in. Lakeflow Connect per ingestione automatizzata (AWS, Okta, Zscaler). Long-term retention su object storage.</w:t>
+            </w:r>
+          </w:p>
+        </w:tc>
+      </w:tr>
+      <w:tr>
+        <w:tc>
+          <w:tcPr>
+            <w:tcW w:type="dxa" w:w="2000"/>
+            <w:shd w:fill="1F4E79" w:val="clear"/>
+            <w:tcMar>
+              <w:top w:type="dxa" w:w="80"/>
+              <w:left w:type="dxa" w:w="120"/>
+              <w:bottom w:type="dxa" w:w="80"/>
+              <w:right w:type="dxa" w:w="120"/>
+            </w:tcMar>
+          </w:tcPr>
+          <w:p>
+            <w:r>
+              <w:rPr>
+                <w:rFonts w:ascii="Calibri" w:cs="Calibri" w:hAnsi="Calibri"/>
+                <w:b/>
+                <w:color w:val="FFFFFF"/>
+                <w:sz w:val="20"/>
+              </w:rPr>
+              <w:t>Target &amp; PA</w:t>
+            </w:r>
+          </w:p>
+        </w:tc>
+        <w:tc>
+          <w:tcPr>
+            <w:tcW w:type="dxa" w:w="7026"/>
+            <w:shd w:fill="DEEAF1" w:val="clear"/>
+            <w:tcMar>
+              <w:top w:type="dxa" w:w="80"/>
+              <w:left w:type="dxa" w:w="120"/>
+              <w:bottom w:type="dxa" w:w="80"/>
+              <w:right w:type="dxa" w:w="120"/>
+            </w:tcMar>
+          </w:tcPr>
+          <w:p>
+            <w:r>
+              <w:rPr>
+                <w:rFonts w:ascii="Calibri" w:cs="Calibri" w:hAnsi="Calibri"/>
+                <w:sz w:val="20"/>
+              </w:rPr>
+              <w:t xml:space="preserve">Enterprise e large mid-market. PA Centrale con cloud ibrido: conformità NIS2/DORA nativa, audit trail immutabile. Richiede qualificazione ACN Cloud PA (da verificare). Non adatto a PA solo on-premise.</w:t>
+            </w:r>
+          </w:p>
+        </w:tc>
+      </w:tr>
+      <w:tr>
+        <w:tc>
+          <w:tcPr>
+            <w:tcW w:type="dxa" w:w="2000"/>
+            <w:shd w:fill="1F4E79" w:val="clear"/>
+            <w:tcMar>
+              <w:top w:type="dxa" w:w="80"/>
+              <w:left w:type="dxa" w:w="120"/>
+              <w:bottom w:type="dxa" w:w="80"/>
+              <w:right w:type="dxa" w:w="120"/>
+            </w:tcMar>
+          </w:tcPr>
+          <w:p>
+            <w:r>
+              <w:rPr>
+                <w:rFonts w:ascii="Calibri" w:cs="Calibri" w:hAnsi="Calibri"/>
+                <w:b/>
+                <w:color w:val="FFFFFF"/>
+                <w:sz w:val="20"/>
+              </w:rPr>
+              <w:t>Perché ora</w:t>
+            </w:r>
+          </w:p>
+        </w:tc>
+        <w:tc>
+          <w:tcPr>
+            <w:tcW w:type="dxa" w:w="7026"/>
+            <w:shd w:fill="FFFFFF" w:val="clear"/>
+            <w:tcMar>
+              <w:top w:type="dxa" w:w="80"/>
+              <w:left w:type="dxa" w:w="120"/>
+              <w:bottom w:type="dxa" w:w="80"/>
+              <w:right w:type="dxa" w:w="120"/>
+            </w:tcMar>
+          </w:tcPr>
+          <w:p>
+            <w:r>
+              <w:rPr>
+                <w:rFonts w:ascii="Calibri" w:cs="Calibri" w:hAnsi="Calibri"/>
+                <w:sz w:val="20"/>
+              </w:rPr>
+              <w:t xml:space="preserve">Crisi di costi SIEM (Splunk post-Cisco). La scadenza NIS2 ACN del 31 maggio impone dimostrazione di capacità monitoring incidenti. Disruption diretta su Splunk, IBM QRadar e Microsoft Sentinel per volumi elevati.</w:t>
+            </w:r>
+          </w:p>
+        </w:tc>
+      </w:tr>
+    </w:tbl>
+    <w:p>
+      <w:pPr>
+        <w:spacing w:after="120" w:before="120"/>
+      </w:pPr>
+    </w:p>
+    <w:p>
+      <w:pPr>
+        <w:pStyle w:val="Heading2"/>
+      </w:pPr>
+      <w:r>
+        <w:rPr>
+          <w:rFonts w:ascii="Calibri" w:cs="Calibri" w:eastAsia="Calibri" w:hAnsi="Calibri"/>
+          <w:b/>
+          <w:color w:val="1F4E79"/>
+          <w:sz w:val="24"/>
+        </w:rPr>
+        <w:t>2. ManageEngine Log360 Cloud — SIEM con Native SOAR</w:t>
+      </w:r>
+    </w:p>
+    <w:tbl>
+      <w:tblPr>
+        <w:tblW w:type="dxa" w:w="9026"/>
+        <w:tblBorders>
+          <w:top w:val="single" w:color="C9C9C9" w:sz="1"/>
+          <w:left w:val="single" w:color="C9C9C9" w:sz="1"/>
+          <w:bottom w:val="single" w:color="C9C9C9" w:sz="1"/>
+          <w:right w:val="single" w:color="C9C9C9" w:sz="1"/>
+          <w:insideH w:val="single" w:color="C9C9C9" w:sz="1"/>
+          <w:insideV w:val="single" w:color="C9C9C9" w:sz="1"/>
+        </w:tblBorders>
+      </w:tblPr>
+      <w:tblGrid>
+        <w:gridCol w:w="2000"/>
+        <w:gridCol w:w="7026"/>
+      </w:tblGrid>
+      <w:tr>
+        <w:tc>
+          <w:tcPr>
+            <w:tcW w:type="dxa" w:w="2000"/>
+            <w:shd w:fill="1F4E79" w:val="clear"/>
+            <w:tcMar>
+              <w:top w:type="dxa" w:w="80"/>
+              <w:left w:type="dxa" w:w="120"/>
+              <w:bottom w:type="dxa" w:w="80"/>
+              <w:right w:type="dxa" w:w="120"/>
+            </w:tcMar>
+          </w:tcPr>
+          <w:p>
+            <w:r>
+              <w:rPr>
+                <w:rFonts w:ascii="Calibri" w:cs="Calibri" w:hAnsi="Calibri"/>
+                <w:b/>
+                <w:color w:val="FFFFFF"/>
+                <w:sz w:val="20"/>
+              </w:rPr>
+              <w:t>Vendor</w:t>
+            </w:r>
+          </w:p>
+        </w:tc>
+        <w:tc>
+          <w:tcPr>
+            <w:tcW w:type="dxa" w:w="7026"/>
+            <w:shd w:fill="DEEAF1" w:val="clear"/>
+            <w:tcMar>
+              <w:top w:type="dxa" w:w="80"/>
+              <w:left w:type="dxa" w:w="120"/>
+              <w:bottom w:type="dxa" w:w="80"/>
+              <w:right w:type="dxa" w:w="120"/>
+            </w:tcMar>
+          </w:tcPr>
+          <w:p>
+            <w:r>
+              <w:rPr>
+                <w:rFonts w:ascii="Calibri" w:cs="Calibri" w:hAnsi="Calibri"/>
+                <w:sz w:val="20"/>
+              </w:rPr>
+              <w:t>ManageEngine / Zoho Corporation (India) · Annuncio: 12 maggio 2026, GA immediata</w:t>
+            </w:r>
+          </w:p>
+        </w:tc>
+      </w:tr>
+      <w:tr>
+        <w:tc>
+          <w:tcPr>
+            <w:tcW w:type="dxa" w:w="2000"/>
+            <w:shd w:fill="1F4E79" w:val="clear"/>
+            <w:tcMar>
+              <w:top w:type="dxa" w:w="80"/>
+              <w:left w:type="dxa" w:w="120"/>
+              <w:bottom w:type="dxa" w:w="80"/>
+              <w:right w:type="dxa" w:w="120"/>
+            </w:tcMar>
+          </w:tcPr>
+          <w:p>
+            <w:r>
+              <w:rPr>
+                <w:rFonts w:ascii="Calibri" w:cs="Calibri" w:hAnsi="Calibri"/>
+                <w:b/>
+                <w:color w:val="FFFFFF"/>
+                <w:sz w:val="20"/>
+              </w:rPr>
+              <w:t>Ambito</w:t>
+            </w:r>
+          </w:p>
+        </w:tc>
+        <w:tc>
+          <w:tcPr>
+            <w:tcW w:type="dxa" w:w="7026"/>
+            <w:shd w:fill="FFFFFF" w:val="clear"/>
+            <w:tcMar>
+              <w:top w:type="dxa" w:w="80"/>
+              <w:left w:type="dxa" w:w="120"/>
+              <w:bottom w:type="dxa" w:w="80"/>
+              <w:right w:type="dxa" w:w="120"/>
+            </w:tcMar>
+          </w:tcPr>
+          <w:p>
+            <w:r>
+              <w:rPr>
+                <w:rFonts w:ascii="Calibri" w:cs="Calibri" w:hAnsi="Calibri"/>
+                <w:sz w:val="20"/>
+              </w:rPr>
+              <w:t>AI &amp; Threat Intelligence / SIEM+SOAR</w:t>
+            </w:r>
+          </w:p>
+        </w:tc>
+      </w:tr>
+      <w:tr>
+        <w:tc>
+          <w:tcPr>
+            <w:tcW w:type="dxa" w:w="2000"/>
+            <w:shd w:fill="1F4E79" w:val="clear"/>
+            <w:tcMar>
+              <w:top w:type="dxa" w:w="80"/>
+              <w:left w:type="dxa" w:w="120"/>
+              <w:bottom w:type="dxa" w:w="80"/>
+              <w:right w:type="dxa" w:w="120"/>
+            </w:tcMar>
+          </w:tcPr>
+          <w:p>
+            <w:r>
+              <w:rPr>
+                <w:rFonts w:ascii="Calibri" w:cs="Calibri" w:hAnsi="Calibri"/>
+                <w:b/>
+                <w:color w:val="FFFFFF"/>
+                <w:sz w:val="20"/>
+              </w:rPr>
+              <w:t>Cosa fa</w:t>
+            </w:r>
+          </w:p>
+        </w:tc>
+        <w:tc>
+          <w:tcPr>
+            <w:tcW w:type="dxa" w:w="7026"/>
+            <w:shd w:fill="DEEAF1" w:val="clear"/>
+            <w:tcMar>
+              <w:top w:type="dxa" w:w="80"/>
+              <w:left w:type="dxa" w:w="120"/>
+              <w:bottom w:type="dxa" w:w="80"/>
+              <w:right w:type="dxa" w:w="120"/>
+            </w:tcMar>
+          </w:tcPr>
+          <w:p>
+            <w:r>
+              <w:rPr>
+                <w:rFonts w:ascii="Calibri" w:cs="Calibri" w:hAnsi="Calibri"/>
+                <w:sz w:val="20"/>
+              </w:rPr>
+              <w:t xml:space="preserve">SOAR nativo integrato nel SIEM senza modulo separato. Visual playbook builder low-code, 7 nuove integrazioni EDR/identity/threat intel, orchestration engine Zoho Qntrl Circuit. Chiude il gap detection-to-response senza costi aggiuntivi.</w:t>
+            </w:r>
+          </w:p>
+        </w:tc>
+      </w:tr>
+      <w:tr>
+        <w:tc>
+          <w:tcPr>
+            <w:tcW w:type="dxa" w:w="2000"/>
+            <w:shd w:fill="1F4E79" w:val="clear"/>
+            <w:tcMar>
+              <w:top w:type="dxa" w:w="80"/>
+              <w:left w:type="dxa" w:w="120"/>
+              <w:bottom w:type="dxa" w:w="80"/>
+              <w:right w:type="dxa" w:w="120"/>
+            </w:tcMar>
+          </w:tcPr>
+          <w:p>
+            <w:r>
+              <w:rPr>
+                <w:rFonts w:ascii="Calibri" w:cs="Calibri" w:hAnsi="Calibri"/>
+                <w:b/>
+                <w:color w:val="FFFFFF"/>
+                <w:sz w:val="20"/>
+              </w:rPr>
+              <w:t>Target &amp; PA</w:t>
+            </w:r>
+          </w:p>
+        </w:tc>
+        <w:tc>
+          <w:tcPr>
+            <w:tcW w:type="dxa" w:w="7026"/>
+            <w:shd w:fill="FFFFFF" w:val="clear"/>
+            <w:tcMar>
+              <w:top w:type="dxa" w:w="80"/>
+              <w:left w:type="dxa" w:w="120"/>
+              <w:bottom w:type="dxa" w:w="80"/>
+              <w:right w:type="dxa" w:w="120"/>
+            </w:tcMar>
+          </w:tcPr>
+          <w:p>
+            <w:r>
+              <w:rPr>
+                <w:rFonts w:ascii="Calibri" w:cs="Calibri" w:hAnsi="Calibri"/>
+                <w:sz w:val="20"/>
+              </w:rPr>
+              <w:t xml:space="preserve">Mid-market e PA di medie dimensioni. Versione on-premise matura per ministeri senza cloud pubblico. NIS2 art. 21 (gestione incidenti): playbook documentabili soddisfano requisiti ACN. Ottimo rapporto qualità/prezzo.</w:t>
+            </w:r>
+          </w:p>
+        </w:tc>
+      </w:tr>
+      <w:tr>
+        <w:tc>
+          <w:tcPr>
+            <w:tcW w:type="dxa" w:w="2000"/>
+            <w:shd w:fill="1F4E79" w:val="clear"/>
+            <w:tcMar>
+              <w:top w:type="dxa" w:w="80"/>
+              <w:left w:type="dxa" w:w="120"/>
+              <w:bottom w:type="dxa" w:w="80"/>
+              <w:right w:type="dxa" w:w="120"/>
+            </w:tcMar>
+          </w:tcPr>
+          <w:p>
+            <w:r>
+              <w:rPr>
+                <w:rFonts w:ascii="Calibri" w:cs="Calibri" w:hAnsi="Calibri"/>
+                <w:b/>
+                <w:color w:val="FFFFFF"/>
+                <w:sz w:val="20"/>
+              </w:rPr>
+              <w:t>Perché ora</w:t>
+            </w:r>
+          </w:p>
+        </w:tc>
+        <w:tc>
+          <w:tcPr>
+            <w:tcW w:type="dxa" w:w="7026"/>
+            <w:shd w:fill="DEEAF1" w:val="clear"/>
+            <w:tcMar>
+              <w:top w:type="dxa" w:w="80"/>
+              <w:left w:type="dxa" w:w="120"/>
+              <w:bottom w:type="dxa" w:w="80"/>
+              <w:right w:type="dxa" w:w="120"/>
+            </w:tcMar>
+          </w:tcPr>
+          <w:p>
+            <w:r>
+              <w:rPr>
+                <w:rFonts w:ascii="Calibri" w:cs="Calibri" w:hAnsi="Calibri"/>
+                <w:sz w:val="20"/>
+              </w:rPr>
+              <w:t xml:space="preserve">Scadenza ottobre 2026 NIS2: misure di sicurezza di base operative e documentate obbligatorie. Il SOAR nativo abbatte la barriera economica per SOC italiani con budget limitato. Risposta diretta ai requisiti D.Lgs. 138/2024.</w:t>
+            </w:r>
+          </w:p>
+        </w:tc>
+      </w:tr>
+    </w:tbl>
+    <w:p>
+      <w:pPr>
+        <w:spacing w:after="120" w:before="120"/>
+      </w:pPr>
+    </w:p>
+    <w:p>
+      <w:pPr>
+        <w:pStyle w:val="Heading2"/>
+      </w:pPr>
+      <w:r>
+        <w:rPr>
+          <w:rFonts w:ascii="Calibri" w:cs="Calibri" w:eastAsia="Calibri" w:hAnsi="Calibri"/>
+          <w:b/>
+          <w:color w:val="1F4E79"/>
+          <w:sz w:val="24"/>
+        </w:rPr>
+        <w:t>3. Forescout eyeInspect — Visibilità OT/IoT Infrastrutture Critiche</w:t>
+      </w:r>
+    </w:p>
+    <w:tbl>
+      <w:tblPr>
+        <w:tblW w:type="dxa" w:w="9026"/>
+        <w:tblBorders>
+          <w:top w:val="single" w:color="C9C9C9" w:sz="1"/>
+          <w:left w:val="single" w:color="C9C9C9" w:sz="1"/>
+          <w:bottom w:val="single" w:color="C9C9C9" w:sz="1"/>
+          <w:right w:val="single" w:color="C9C9C9" w:sz="1"/>
+          <w:insideH w:val="single" w:color="C9C9C9" w:sz="1"/>
+          <w:insideV w:val="single" w:color="C9C9C9" w:sz="1"/>
+        </w:tblBorders>
+      </w:tblPr>
+      <w:tblGrid>
+        <w:gridCol w:w="2000"/>
+        <w:gridCol w:w="7026"/>
+      </w:tblGrid>
+      <w:tr>
+        <w:tc>
+          <w:tcPr>
+            <w:tcW w:type="dxa" w:w="2000"/>
+            <w:shd w:fill="1F4E79" w:val="clear"/>
+            <w:tcMar>
+              <w:top w:type="dxa" w:w="80"/>
+              <w:left w:type="dxa" w:w="120"/>
+              <w:bottom w:type="dxa" w:w="80"/>
+              <w:right w:type="dxa" w:w="120"/>
+            </w:tcMar>
+          </w:tcPr>
+          <w:p>
+            <w:r>
+              <w:rPr>
+                <w:rFonts w:ascii="Calibri" w:cs="Calibri" w:hAnsi="Calibri"/>
+                <w:b/>
+                <w:color w:val="FFFFFF"/>
+                <w:sz w:val="20"/>
+              </w:rPr>
+              <w:t>Vendor</w:t>
+            </w:r>
+          </w:p>
+        </w:tc>
+        <w:tc>
+          <w:tcPr>
+            <w:tcW w:type="dxa" w:w="7026"/>
+            <w:shd w:fill="DEEAF1" w:val="clear"/>
+            <w:tcMar>
+              <w:top w:type="dxa" w:w="80"/>
+              <w:left w:type="dxa" w:w="120"/>
+              <w:bottom w:type="dxa" w:w="80"/>
+              <w:right w:type="dxa" w:w="120"/>
+            </w:tcMar>
+          </w:tcPr>
+          <w:p>
+            <w:r>
+              <w:rPr>
+                <w:rFonts w:ascii="Calibri" w:cs="Calibri" w:hAnsi="Calibri"/>
+                <w:sz w:val="20"/>
+              </w:rPr>
+              <w:t>Forescout Technologies (USA) · Report: 23 marzo 2026 · FedRAMP High ATO 2026</w:t>
+            </w:r>
+          </w:p>
+        </w:tc>
+      </w:tr>
+      <w:tr>
+        <w:tc>
+          <w:tcPr>
+            <w:tcW w:type="dxa" w:w="2000"/>
+            <w:shd w:fill="1F4E79" w:val="clear"/>
+            <w:tcMar>
+              <w:top w:type="dxa" w:w="80"/>
+              <w:left w:type="dxa" w:w="120"/>
+              <w:bottom w:type="dxa" w:w="80"/>
+              <w:right w:type="dxa" w:w="120"/>
+            </w:tcMar>
+          </w:tcPr>
+          <w:p>
+            <w:r>
+              <w:rPr>
+                <w:rFonts w:ascii="Calibri" w:cs="Calibri" w:hAnsi="Calibri"/>
+                <w:b/>
+                <w:color w:val="FFFFFF"/>
+                <w:sz w:val="20"/>
+              </w:rPr>
+              <w:t>Ambito</w:t>
+            </w:r>
+          </w:p>
+        </w:tc>
+        <w:tc>
+          <w:tcPr>
+            <w:tcW w:type="dxa" w:w="7026"/>
+            <w:shd w:fill="FFFFFF" w:val="clear"/>
+            <w:tcMar>
+              <w:top w:type="dxa" w:w="80"/>
+              <w:left w:type="dxa" w:w="120"/>
+              <w:bottom w:type="dxa" w:w="80"/>
+              <w:right w:type="dxa" w:w="120"/>
+            </w:tcMar>
+          </w:tcPr>
+          <w:p>
+            <w:r>
+              <w:rPr>
+                <w:rFonts w:ascii="Calibri" w:cs="Calibri" w:hAnsi="Calibri"/>
+                <w:sz w:val="20"/>
+              </w:rPr>
+              <w:t>OT/IoT &amp; Infrastrutture Critiche</w:t>
+            </w:r>
+          </w:p>
+        </w:tc>
+      </w:tr>
+      <w:tr>
+        <w:tc>
+          <w:tcPr>
+            <w:tcW w:type="dxa" w:w="2000"/>
+            <w:shd w:fill="1F4E79" w:val="clear"/>
+            <w:tcMar>
+              <w:top w:type="dxa" w:w="80"/>
+              <w:left w:type="dxa" w:w="120"/>
+              <w:bottom w:type="dxa" w:w="80"/>
+              <w:right w:type="dxa" w:w="120"/>
+            </w:tcMar>
+          </w:tcPr>
+          <w:p>
+            <w:r>
+              <w:rPr>
+                <w:rFonts w:ascii="Calibri" w:cs="Calibri" w:hAnsi="Calibri"/>
+                <w:b/>
+                <w:color w:val="FFFFFF"/>
+                <w:sz w:val="20"/>
+              </w:rPr>
+              <w:t>Cosa fa</w:t>
+            </w:r>
+          </w:p>
+        </w:tc>
+        <w:tc>
+          <w:tcPr>
+            <w:tcW w:type="dxa" w:w="7026"/>
+            <w:shd w:fill="DEEAF1" w:val="clear"/>
+            <w:tcMar>
+              <w:top w:type="dxa" w:w="80"/>
+              <w:left w:type="dxa" w:w="120"/>
+              <w:bottom w:type="dxa" w:w="80"/>
+              <w:right w:type="dxa" w:w="120"/>
+            </w:tcMar>
+          </w:tcPr>
+          <w:p>
+            <w:r>
+              <w:rPr>
+                <w:rFonts w:ascii="Calibri" w:cs="Calibri" w:hAnsi="Calibri"/>
+                <w:sz w:val="20"/>
+              </w:rPr>
+              <w:t xml:space="preserve">Visibilità agentless su reti IT/OT/IoT convergenti. Report 2026: 11 nuovi tipi di device a rischio (PDU, I/O module, BACnet router, RFID reader). L’infrastruttura di rete ha superato gli endpoint come categoria più rischiosa.</w:t>
+            </w:r>
+          </w:p>
+        </w:tc>
+      </w:tr>
+      <w:tr>
+        <w:tc>
+          <w:tcPr>
+            <w:tcW w:type="dxa" w:w="2000"/>
+            <w:shd w:fill="1F4E79" w:val="clear"/>
+            <w:tcMar>
+              <w:top w:type="dxa" w:w="80"/>
+              <w:left w:type="dxa" w:w="120"/>
+              <w:bottom w:type="dxa" w:w="80"/>
+              <w:right w:type="dxa" w:w="120"/>
+            </w:tcMar>
+          </w:tcPr>
+          <w:p>
+            <w:r>
+              <w:rPr>
+                <w:rFonts w:ascii="Calibri" w:cs="Calibri" w:hAnsi="Calibri"/>
+                <w:b/>
+                <w:color w:val="FFFFFF"/>
+                <w:sz w:val="20"/>
+              </w:rPr>
+              <w:t>Infrastruttura</w:t>
+            </w:r>
+          </w:p>
+        </w:tc>
+        <w:tc>
+          <w:tcPr>
+            <w:tcW w:type="dxa" w:w="7026"/>
+            <w:shd w:fill="FFFFFF" w:val="clear"/>
+            <w:tcMar>
+              <w:top w:type="dxa" w:w="80"/>
+              <w:left w:type="dxa" w:w="120"/>
+              <w:bottom w:type="dxa" w:w="80"/>
+              <w:right w:type="dxa" w:w="120"/>
+            </w:tcMar>
+          </w:tcPr>
+          <w:p>
+            <w:r>
+              <w:rPr>
+                <w:rFonts w:ascii="Calibri" w:cs="Calibri" w:hAnsi="Calibri"/>
+                <w:sz w:val="20"/>
+              </w:rPr>
+              <w:t xml:space="preserve">On-premise (appliance fisica/virtuale) per reti OT air-gap + cloud connector per visibilità centralizzata. Monitoring passivo senza agenti sui device OT. Integrazione SIEM, CMDB, firewall. FedRAMP High ATO.</w:t>
+            </w:r>
+          </w:p>
+        </w:tc>
+      </w:tr>
+      <w:tr>
+        <w:tc>
+          <w:tcPr>
+            <w:tcW w:type="dxa" w:w="2000"/>
+            <w:shd w:fill="1F4E79" w:val="clear"/>
+            <w:tcMar>
+              <w:top w:type="dxa" w:w="80"/>
+              <w:left w:type="dxa" w:w="120"/>
+              <w:bottom w:type="dxa" w:w="80"/>
+              <w:right w:type="dxa" w:w="120"/>
+            </w:tcMar>
+          </w:tcPr>
+          <w:p>
+            <w:r>
+              <w:rPr>
+                <w:rFonts w:ascii="Calibri" w:cs="Calibri" w:hAnsi="Calibri"/>
+                <w:b/>
+                <w:color w:val="FFFFFF"/>
+                <w:sz w:val="20"/>
+              </w:rPr>
+              <w:t>Target &amp; PA</w:t>
+            </w:r>
+          </w:p>
+        </w:tc>
+        <w:tc>
+          <w:tcPr>
+            <w:tcW w:type="dxa" w:w="7026"/>
+            <w:shd w:fill="DEEAF1" w:val="clear"/>
+            <w:tcMar>
+              <w:top w:type="dxa" w:w="80"/>
+              <w:left w:type="dxa" w:w="120"/>
+              <w:bottom w:type="dxa" w:w="80"/>
+              <w:right w:type="dxa" w:w="120"/>
+            </w:tcMar>
+          </w:tcPr>
+          <w:p>
+            <w:r>
+              <w:rPr>
+                <w:rFonts w:ascii="Calibri" w:cs="Calibri" w:hAnsi="Calibri"/>
+                <w:sz w:val="20"/>
+              </w:rPr>
+              <w:t xml:space="preserve">PA Centrale con edifici BMS/BACnet (ministeri, sedi istituzionali), utilities, sanità, difesa. I BACnet router degli edifici governativi italiani sono nella top-5 OT più rischiosi e quasi universalmente non monitorati.</w:t>
+            </w:r>
+          </w:p>
+        </w:tc>
+      </w:tr>
+      <w:tr>
+        <w:tc>
+          <w:tcPr>
+            <w:tcW w:type="dxa" w:w="2000"/>
+            <w:shd w:fill="1F4E79" w:val="clear"/>
+            <w:tcMar>
+              <w:top w:type="dxa" w:w="80"/>
+              <w:left w:type="dxa" w:w="120"/>
+              <w:bottom w:type="dxa" w:w="80"/>
+              <w:right w:type="dxa" w:w="120"/>
+            </w:tcMar>
+          </w:tcPr>
+          <w:p>
+            <w:r>
+              <w:rPr>
+                <w:rFonts w:ascii="Calibri" w:cs="Calibri" w:hAnsi="Calibri"/>
+                <w:b/>
+                <w:color w:val="FFFFFF"/>
+                <w:sz w:val="20"/>
+              </w:rPr>
+              <w:t>Perché ora</w:t>
+            </w:r>
+          </w:p>
+        </w:tc>
+        <w:tc>
+          <w:tcPr>
+            <w:tcW w:type="dxa" w:w="7026"/>
+            <w:shd w:fill="FFFFFF" w:val="clear"/>
+            <w:tcMar>
+              <w:top w:type="dxa" w:w="80"/>
+              <w:left w:type="dxa" w:w="120"/>
+              <w:bottom w:type="dxa" w:w="80"/>
+              <w:right w:type="dxa" w:w="120"/>
+            </w:tcMar>
+          </w:tcPr>
+          <w:p>
+            <w:r>
+              <w:rPr>
+                <w:rFonts w:ascii="Calibri" w:cs="Calibri" w:hAnsi="Calibri"/>
+                <w:sz w:val="20"/>
+              </w:rPr>
+              <w:t xml:space="preserve">NIS2 Allegato I: energia e infrastrutture digitali tra settori critici. PSNC identifica convergenza IT/OT come priorità. ACN richiede asset inventory OT. Un attacco BACnet può compromettere fisicamente edifici governativi (HVAC, badge, antincendio) senza toccare le reti IT.</w:t>
+            </w:r>
+          </w:p>
+        </w:tc>
+      </w:tr>
+    </w:tbl>
+    <w:p>
+      <w:pPr>
+        <w:spacing w:after="120" w:before="120"/>
+      </w:pPr>
+    </w:p>
+    <w:p>
+      <w:pPr>
+        <w:pStyle w:val="Heading2"/>
+      </w:pPr>
+      <w:r>
+        <w:rPr>
+          <w:rFonts w:ascii="Calibri" w:cs="Calibri" w:eastAsia="Calibri" w:hAnsi="Calibri"/>
+          <w:b/>
+          <w:color w:val="1F4E79"/>
+          <w:sz w:val="24"/>
+        </w:rPr>
+        <w:t>Segnali della settimana</w:t>
+      </w:r>
+    </w:p>
+    <w:tbl>
+      <w:tblPr>
+        <w:tblW w:type="dxa" w:w="9026"/>
+        <w:tblBorders>
+          <w:top w:val="single" w:color="C9C9C9" w:sz="1"/>
+          <w:left w:val="single" w:color="C9C9C9" w:sz="1"/>
+          <w:bottom w:val="single" w:color="C9C9C9" w:sz="1"/>
+          <w:right w:val="single" w:color="C9C9C9" w:sz="1"/>
+          <w:insideH w:val="single" w:color="C9C9C9" w:sz="1"/>
+          <w:insideV w:val="single" w:color="C9C9C9" w:sz="1"/>
+        </w:tblBorders>
+      </w:tblPr>
+      <w:tblGrid>
+        <w:gridCol w:w="6000"/>
+        <w:gridCol w:w="3026"/>
+      </w:tblGrid>
+      <w:tr>
+        <w:tc>
+          <w:tcPr>
+            <w:tcW w:type="dxa" w:w="6000"/>
+            <w:shd w:fill="1F4E79" w:val="clear"/>
+            <w:tcMar>
+              <w:top w:type="dxa" w:w="80"/>
+              <w:left w:type="dxa" w:w="120"/>
+              <w:bottom w:type="dxa" w:w="80"/>
+              <w:right w:type="dxa" w:w="120"/>
+            </w:tcMar>
+          </w:tcPr>
+          <w:p>
+            <w:r>
+              <w:rPr>
+                <w:rFonts w:ascii="Calibri" w:cs="Calibri" w:hAnsi="Calibri"/>
+                <w:b/>
+                <w:color w:val="FFFFFF"/>
+                <w:sz w:val="20"/>
+              </w:rPr>
+              <w:t>Segnale</w:t>
+            </w:r>
+          </w:p>
+        </w:tc>
+        <w:tc>
+          <w:tcPr>
+            <w:tcW w:type="dxa" w:w="3026"/>
+            <w:shd w:fill="1F4E79" w:val="clear"/>
+            <w:tcMar>
+              <w:top w:type="dxa" w:w="80"/>
+              <w:left w:type="dxa" w:w="120"/>
+              <w:bottom w:type="dxa" w:w="80"/>
+              <w:right w:type="dxa" w:w="120"/>
+            </w:tcMar>
+          </w:tcPr>
+          <w:p>
+            <w:r>
+              <w:rPr>
+                <w:rFonts w:ascii="Calibri" w:cs="Calibri" w:hAnsi="Calibri"/>
+                <w:b/>
+                <w:color w:val="FFFFFF"/>
+                <w:sz w:val="20"/>
+              </w:rPr>
+              <w:t>Impatto</w:t>
+            </w:r>
+          </w:p>
+        </w:tc>
+      </w:tr>
+      <w:tr>
+        <w:tc>
+          <w:tcPr>
+            <w:tcW w:type="dxa" w:w="6000"/>
+            <w:shd w:fill="DEEAF1" w:val="clear"/>
+            <w:tcMar>
+              <w:top w:type="dxa" w:w="80"/>
+              <w:left w:type="dxa" w:w="120"/>
+              <w:bottom w:type="dxa" w:w="80"/>
+              <w:right w:type="dxa" w:w="120"/>
+            </w:tcMar>
+          </w:tcPr>
+          <w:p>
+            <w:r>
+              <w:rPr>
+                <w:rFonts w:ascii="Calibri" w:cs="Calibri" w:hAnsi="Calibri"/>
+                <w:sz w:val="20"/>
+              </w:rPr>
+              <w:t>Scadenza NIS2 ACN 31 maggio 2026: aggiornamento portale e registrazione</w:t>
+            </w:r>
+          </w:p>
+        </w:tc>
+        <w:tc>
+          <w:tcPr>
+            <w:tcW w:type="dxa" w:w="3026"/>
+            <w:shd w:fill="DEEAF1" w:val="clear"/>
+            <w:tcMar>
+              <w:top w:type="dxa" w:w="80"/>
+              <w:left w:type="dxa" w:w="120"/>
+              <w:bottom w:type="dxa" w:w="80"/>
+              <w:right w:type="dxa" w:w="120"/>
+            </w:tcMar>
+          </w:tcPr>
+          <w:p>
+            <w:r>
+              <w:rPr>
+                <w:rFonts w:ascii="Calibri" w:cs="Calibri" w:hAnsi="Calibri"/>
+                <w:sz w:val="20"/>
+              </w:rPr>
+              <w:t>Critico · PA e operatori essenziali</w:t>
+            </w:r>
+          </w:p>
+        </w:tc>
+      </w:tr>
+      <w:tr>
+        <w:tc>
+          <w:tcPr>
+            <w:tcW w:type="dxa" w:w="6000"/>
+            <w:shd w:fill="FFFFFF" w:val="clear"/>
+            <w:tcMar>
+              <w:top w:type="dxa" w:w="80"/>
+              <w:left w:type="dxa" w:w="120"/>
+              <w:bottom w:type="dxa" w:w="80"/>
+              <w:right w:type="dxa" w:w="120"/>
+            </w:tcMar>
+          </w:tcPr>
+          <w:p>
+            <w:r>
+              <w:rPr>
+                <w:rFonts w:ascii="Calibri" w:cs="Calibri" w:hAnsi="Calibri"/>
+                <w:sz w:val="20"/>
+              </w:rPr>
+              <w:t>Databricks Lakewatch Private Preview: SIEM agentico a -80% TCO</w:t>
+            </w:r>
+          </w:p>
+        </w:tc>
+        <w:tc>
+          <w:tcPr>
+            <w:tcW w:type="dxa" w:w="3026"/>
+            <w:shd w:fill="FFFFFF" w:val="clear"/>
+            <w:tcMar>
+              <w:top w:type="dxa" w:w="80"/>
+              <w:left w:type="dxa" w:w="120"/>
+              <w:bottom w:type="dxa" w:w="80"/>
+              <w:right w:type="dxa" w:w="120"/>
+            </w:tcMar>
+          </w:tcPr>
+          <w:p>
+            <w:r>
+              <w:rPr>
+                <w:rFonts w:ascii="Calibri" w:cs="Calibri" w:hAnsi="Calibri"/>
+                <w:sz w:val="20"/>
+              </w:rPr>
+              <w:t>Alto · Disruption mercato SIEM enterprise</w:t>
+            </w:r>
+          </w:p>
+        </w:tc>
+      </w:tr>
+      <w:tr>
+        <w:tc>
+          <w:tcPr>
+            <w:tcW w:type="dxa" w:w="6000"/>
+            <w:shd w:fill="DEEAF1" w:val="clear"/>
+            <w:tcMar>
+              <w:top w:type="dxa" w:w="80"/>
+              <w:left w:type="dxa" w:w="120"/>
+              <w:bottom w:type="dxa" w:w="80"/>
+              <w:right w:type="dxa" w:w="120"/>
+            </w:tcMar>
+          </w:tcPr>
+          <w:p>
+            <w:r>
+              <w:rPr>
+                <w:rFonts w:ascii="Calibri" w:cs="Calibri" w:hAnsi="Calibri"/>
+                <w:sz w:val="20"/>
+              </w:rPr>
+              <w:t>ManageEngine Log360 SOAR nativo: risposta incidenti senza costi aggiuntivi</w:t>
+            </w:r>
+          </w:p>
+        </w:tc>
+        <w:tc>
+          <w:tcPr>
+            <w:tcW w:type="dxa" w:w="3026"/>
+            <w:shd w:fill="DEEAF1" w:val="clear"/>
+            <w:tcMar>
+              <w:top w:type="dxa" w:w="80"/>
+              <w:left w:type="dxa" w:w="120"/>
+              <w:bottom w:type="dxa" w:w="80"/>
+              <w:right w:type="dxa" w:w="120"/>
+            </w:tcMar>
+          </w:tcPr>
+          <w:p>
+            <w:r>
+              <w:rPr>
+                <w:rFonts w:ascii="Calibri" w:cs="Calibri" w:hAnsi="Calibri"/>
+                <w:sz w:val="20"/>
+              </w:rPr>
+              <w:t>Alto · Mid-market e PA budget-limited</w:t>
+            </w:r>
+          </w:p>
+        </w:tc>
+      </w:tr>
+      <w:tr>
+        <w:tc>
+          <w:tcPr>
+            <w:tcW w:type="dxa" w:w="6000"/>
+            <w:shd w:fill="FFFFFF" w:val="clear"/>
+            <w:tcMar>
+              <w:top w:type="dxa" w:w="80"/>
+              <w:left w:type="dxa" w:w="120"/>
+              <w:bottom w:type="dxa" w:w="80"/>
+              <w:right w:type="dxa" w:w="120"/>
+            </w:tcMar>
+          </w:tcPr>
+          <w:p>
+            <w:r>
+              <w:rPr>
+                <w:rFonts w:ascii="Calibri" w:cs="Calibri" w:hAnsi="Calibri"/>
+                <w:sz w:val="20"/>
+              </w:rPr>
+              <w:t>Forescout: 11 nuovi device OT rischiosi, BACnet router in top-5</w:t>
+            </w:r>
+          </w:p>
+        </w:tc>
+        <w:tc>
+          <w:tcPr>
+            <w:tcW w:type="dxa" w:w="3026"/>
+            <w:shd w:fill="FFFFFF" w:val="clear"/>
+            <w:tcMar>
+              <w:top w:type="dxa" w:w="80"/>
+              <w:left w:type="dxa" w:w="120"/>
+              <w:bottom w:type="dxa" w:w="80"/>
+              <w:right w:type="dxa" w:w="120"/>
+            </w:tcMar>
+          </w:tcPr>
+          <w:p>
+            <w:r>
+              <w:rPr>
+                <w:rFonts w:ascii="Calibri" w:cs="Calibri" w:hAnsi="Calibri"/>
+                <w:sz w:val="20"/>
+              </w:rPr>
+              <w:t>Alto · PA, energia, sanità</w:t>
+            </w:r>
+          </w:p>
+        </w:tc>
+      </w:tr>
+      <w:tr>
+        <w:tc>
+          <w:tcPr>
+            <w:tcW w:type="dxa" w:w="6000"/>
+            <w:shd w:fill="DEEAF1" w:val="clear"/>
+            <w:tcMar>
+              <w:top w:type="dxa" w:w="80"/>
+              <w:left w:type="dxa" w:w="120"/>
+              <w:bottom w:type="dxa" w:w="80"/>
+              <w:right w:type="dxa" w:w="120"/>
+            </w:tcMar>
+          </w:tcPr>
+          <w:p>
+            <w:r>
+              <w:rPr>
+                <w:rFonts w:ascii="Calibri" w:cs="Calibri" w:hAnsi="Calibri"/>
+                <w:sz w:val="20"/>
+              </w:rPr>
+              <w:t>ZTNA: microsegmentazione fallisce senza governance continua delle policy</w:t>
+            </w:r>
+          </w:p>
+        </w:tc>
+        <w:tc>
+          <w:tcPr>
+            <w:tcW w:type="dxa" w:w="3026"/>
+            <w:shd w:fill="DEEAF1" w:val="clear"/>
+            <w:tcMar>
+              <w:top w:type="dxa" w:w="80"/>
+              <w:left w:type="dxa" w:w="120"/>
+              <w:bottom w:type="dxa" w:w="80"/>
+              <w:right w:type="dxa" w:w="120"/>
+            </w:tcMar>
+          </w:tcPr>
+          <w:p>
+            <w:r>
+              <w:rPr>
+                <w:rFonts w:ascii="Calibri" w:cs="Calibri" w:hAnsi="Calibri"/>
+                <w:sz w:val="20"/>
+              </w:rPr>
+              <w:t>Medio · Implicazioni operative per ZTA</w:t>
+            </w:r>
+          </w:p>
+        </w:tc>
+      </w:tr>
+    </w:tbl>
+    <w:p>
+      <w:pPr>
+        <w:spacing w:after="120" w:before="240"/>
+      </w:pPr>
+      <w:r>
+        <w:rPr>
+          <w:rFonts w:ascii="Calibri" w:cs="Calibri" w:eastAsia="Calibri" w:hAnsi="Calibri"/>
+          <w:i/>
+          <w:color w:val="595959"/>
+          <w:sz w:val="18"/>
+        </w:rPr>
+        <w:t xml:space="preserve">Prossimo briefing: 7 giugno 2026 · Generato automaticamente da Claude · Cowork</w:t>
+      </w:r>
     </w:p>
     <w:p>
       <w:r>

</xml_diff>

<commit_message>
Update diario W23 - 2026-06-07
</commit_message>
<xml_diff>
--- a/diario-cybersecurity-2026.docx
+++ b/diario-cybersecurity-2026.docx
@@ -111,6 +111,22 @@
       <w:pPr>
         <w:spacing w:after="60" w:before="120"/>
       </w:pPr>
+      <w:hyperlink w:history="1" w:anchor="bm_w23">
+        <w:r>
+          <w:rPr>
+            <w:rStyle w:val="Hyperlink"/>
+            <w:rFonts w:ascii="Calibri" w:cs="Calibri" w:eastAsia="Calibri" w:hAnsi="Calibri"/>
+            <w:sz w:val="22"/>
+            <w:szCs w:val="22"/>
+          </w:rPr>
+          <w:t xml:space="preserve">W23 · 7 giugno 2026 — Sysdig Headless CNAPP · CrowdStrike Falcon Next-Gen Identity · Nozomi Vantage IQ Q2</w:t>
+        </w:r>
+      </w:hyperlink>
+    </w:p>
+    <w:p>
+      <w:pPr>
+        <w:spacing w:after="60" w:before="120"/>
+      </w:pPr>
       <w:hyperlink w:history="1" w:anchor="bm_w22">
         <w:r>
           <w:rPr>
@@ -154,6 +170,1323 @@
           <w:t xml:space="preserve">W21 · 21 maggio 2026 — Idira (PANW) · Sysdig Headless Cloud Security · Dragos Platform 3.1</w:t>
         </w:r>
       </w:hyperlink>
+    </w:p>
+    <w:p>
+      <w:r>
+        <w:br w:type="page"/>
+      </w:r>
+    </w:p>
+    <w:p>
+      <w:pPr>
+        <w:pStyle w:val="Heading1"/>
+      </w:pPr>
+      <w:bookmarkStart w:name="bm_w23" w:id="300"/>
+      <w:r>
+        <w:rPr>
+          <w:rFonts w:ascii="Calibri" w:cs="Calibri" w:eastAsia="Calibri" w:hAnsi="Calibri"/>
+          <w:b/>
+          <w:bCs/>
+          <w:color w:val="1F4E79"/>
+          <w:sz w:val="28"/>
+          <w:szCs w:val="28"/>
+        </w:rPr>
+        <w:t xml:space="preserve">W23 · 7 giugno 2026</w:t>
+      </w:r>
+      <w:bookmarkEnd w:id="300"/>
+    </w:p>
+    <w:tbl>
+      <w:tblPr>
+        <w:tblW w:type="dxa" w:w="9026"/>
+        <w:tblBorders>
+          <w:top w:val="single" w:color="auto" w:sz="4"/>
+          <w:left w:val="single" w:color="auto" w:sz="4"/>
+          <w:bottom w:val="single" w:color="auto" w:sz="4"/>
+          <w:right w:val="single" w:color="auto" w:sz="4"/>
+          <w:insideH w:val="single" w:color="auto" w:sz="4"/>
+          <w:insideV w:val="single" w:color="auto" w:sz="4"/>
+        </w:tblBorders>
+      </w:tblPr>
+      <w:tblGrid>
+        <w:gridCol w:w="2252"/>
+        <w:gridCol w:w="2252"/>
+        <w:gridCol w:w="2251"/>
+        <w:gridCol w:w="2271"/>
+      </w:tblGrid>
+      <w:tr>
+        <w:tc>
+          <w:tcPr>
+            <w:tcW w:type="dxa" w:w="2252"/>
+            <w:tcBorders>
+              <w:top w:val="single" w:color="C9C9C9" w:sz="1"/>
+              <w:left w:val="single" w:color="C9C9C9" w:sz="1"/>
+              <w:bottom w:val="single" w:color="C9C9C9" w:sz="1"/>
+              <w:right w:val="single" w:color="C9C9C9" w:sz="1"/>
+            </w:tcBorders>
+            <w:shd w:fill="DEEAF1" w:val="clear"/>
+            <w:tcMar>
+              <w:top w:type="dxa" w:w="80"/>
+              <w:left w:type="dxa" w:w="120"/>
+              <w:bottom w:type="dxa" w:w="80"/>
+              <w:right w:type="dxa" w:w="120"/>
+            </w:tcMar>
+          </w:tcPr>
+          <w:p>
+            <w:r>
+              <w:rPr>
+                <w:rFonts w:ascii="Calibri" w:cs="Calibri" w:eastAsia="Calibri" w:hAnsi="Calibri"/>
+                <w:b/>
+                <w:color w:val="1F4E79"/>
+                <w:sz w:val="20"/>
+              </w:rPr>
+              <w:t>Data</w:t>
+            </w:r>
+          </w:p>
+          <w:p>
+            <w:r>
+              <w:rPr>
+                <w:rFonts w:ascii="Calibri" w:cs="Calibri" w:eastAsia="Calibri" w:hAnsi="Calibri"/>
+                <w:sz w:val="20"/>
+              </w:rPr>
+              <w:t>7 giugno 2026</w:t>
+            </w:r>
+          </w:p>
+        </w:tc>
+        <w:tc>
+          <w:tcPr>
+            <w:tcW w:type="dxa" w:w="2252"/>
+            <w:tcBorders>
+              <w:top w:val="single" w:color="C9C9C9" w:sz="1"/>
+              <w:left w:val="single" w:color="C9C9C9" w:sz="1"/>
+              <w:bottom w:val="single" w:color="C9C9C9" w:sz="1"/>
+              <w:right w:val="single" w:color="C9C9C9" w:sz="1"/>
+            </w:tcBorders>
+            <w:shd w:fill="DEEAF1" w:val="clear"/>
+            <w:tcMar>
+              <w:top w:type="dxa" w:w="80"/>
+              <w:left w:type="dxa" w:w="120"/>
+              <w:bottom w:type="dxa" w:w="80"/>
+              <w:right w:type="dxa" w:w="120"/>
+            </w:tcMar>
+          </w:tcPr>
+          <w:p>
+            <w:r>
+              <w:rPr>
+                <w:rFonts w:ascii="Calibri" w:cs="Calibri" w:eastAsia="Calibri" w:hAnsi="Calibri"/>
+                <w:b/>
+                <w:color w:val="1F4E79"/>
+                <w:sz w:val="20"/>
+              </w:rPr>
+              <w:t>Settimana</w:t>
+            </w:r>
+          </w:p>
+          <w:p>
+            <w:r>
+              <w:rPr>
+                <w:rFonts w:ascii="Calibri" w:cs="Calibri" w:eastAsia="Calibri" w:hAnsi="Calibri"/>
+                <w:sz w:val="20"/>
+              </w:rPr>
+              <w:t>W23 2026</w:t>
+            </w:r>
+          </w:p>
+        </w:tc>
+        <w:tc>
+          <w:tcPr>
+            <w:tcW w:type="dxa" w:w="2251"/>
+            <w:tcBorders>
+              <w:top w:val="single" w:color="C9C9C9" w:sz="1"/>
+              <w:left w:val="single" w:color="C9C9C9" w:sz="1"/>
+              <w:bottom w:val="single" w:color="C9C9C9" w:sz="1"/>
+              <w:right w:val="single" w:color="C9C9C9" w:sz="1"/>
+            </w:tcBorders>
+            <w:shd w:fill="DEEAF1" w:val="clear"/>
+            <w:tcMar>
+              <w:top w:type="dxa" w:w="80"/>
+              <w:left w:type="dxa" w:w="120"/>
+              <w:bottom w:type="dxa" w:w="80"/>
+              <w:right w:type="dxa" w:w="120"/>
+            </w:tcMar>
+          </w:tcPr>
+          <w:p>
+            <w:r>
+              <w:rPr>
+                <w:rFonts w:ascii="Calibri" w:cs="Calibri" w:eastAsia="Calibri" w:hAnsi="Calibri"/>
+                <w:b/>
+                <w:color w:val="1F4E79"/>
+                <w:sz w:val="20"/>
+              </w:rPr>
+              <w:t>Ambiti</w:t>
+            </w:r>
+          </w:p>
+          <w:p>
+            <w:r>
+              <w:rPr>
+                <w:rFonts w:ascii="Calibri" w:cs="Calibri" w:eastAsia="Calibri" w:hAnsi="Calibri"/>
+                <w:sz w:val="20"/>
+              </w:rPr>
+              <w:t>Cloud Security · Endpoint/Identity · OT/IoT</w:t>
+            </w:r>
+          </w:p>
+        </w:tc>
+        <w:tc>
+          <w:tcPr>
+            <w:tcW w:type="dxa" w:w="2271"/>
+            <w:tcBorders>
+              <w:top w:val="single" w:color="C9C9C9" w:sz="1"/>
+              <w:left w:val="single" w:color="C9C9C9" w:sz="1"/>
+              <w:bottom w:val="single" w:color="C9C9C9" w:sz="1"/>
+              <w:right w:val="single" w:color="C9C9C9" w:sz="1"/>
+            </w:tcBorders>
+            <w:shd w:fill="DEEAF1" w:val="clear"/>
+            <w:tcMar>
+              <w:top w:type="dxa" w:w="80"/>
+              <w:left w:type="dxa" w:w="120"/>
+              <w:bottom w:type="dxa" w:w="80"/>
+              <w:right w:type="dxa" w:w="120"/>
+            </w:tcMar>
+          </w:tcPr>
+          <w:p>
+            <w:r>
+              <w:rPr>
+                <w:rFonts w:ascii="Calibri" w:cs="Calibri" w:eastAsia="Calibri" w:hAnsi="Calibri"/>
+                <w:b/>
+                <w:color w:val="1F4E79"/>
+                <w:sz w:val="20"/>
+              </w:rPr>
+              <w:t>Target</w:t>
+            </w:r>
+          </w:p>
+          <w:p>
+            <w:r>
+              <w:rPr>
+                <w:rFonts w:ascii="Calibri" w:cs="Calibri" w:eastAsia="Calibri" w:hAnsi="Calibri"/>
+                <w:sz w:val="20"/>
+              </w:rPr>
+              <w:t>Enterprise · Mid-market · PA Centrale</w:t>
+            </w:r>
+          </w:p>
+        </w:tc>
+      </w:tr>
+    </w:tbl>
+    <w:p>
+      <w:pPr>
+        <w:spacing w:after="120" w:before="240"/>
+      </w:pPr>
+    </w:p>
+    <w:p>
+      <w:pPr>
+        <w:pStyle w:val="Heading2"/>
+      </w:pPr>
+      <w:r>
+        <w:rPr>
+          <w:rFonts w:ascii="Calibri" w:cs="Calibri" w:eastAsia="Calibri" w:hAnsi="Calibri"/>
+          <w:b/>
+          <w:color w:val="1F4E79"/>
+          <w:sz w:val="24"/>
+        </w:rPr>
+        <w:t>1. Sysdig Headless Cloud Security Platform</w:t>
+      </w:r>
+    </w:p>
+    <w:tbl>
+      <w:tblPr>
+        <w:tblW w:type="dxa" w:w="9026"/>
+        <w:tblBorders>
+          <w:top w:val="single" w:color="C9C9C9" w:sz="1"/>
+          <w:left w:val="single" w:color="C9C9C9" w:sz="1"/>
+          <w:bottom w:val="single" w:color="C9C9C9" w:sz="1"/>
+          <w:right w:val="single" w:color="C9C9C9" w:sz="1"/>
+          <w:insideH w:val="single" w:color="C9C9C9" w:sz="1"/>
+          <w:insideV w:val="single" w:color="C9C9C9" w:sz="1"/>
+        </w:tblBorders>
+      </w:tblPr>
+      <w:tblGrid>
+        <w:gridCol w:w="2000"/>
+        <w:gridCol w:w="7026"/>
+      </w:tblGrid>
+      <w:tr>
+        <w:tc>
+          <w:tcPr>
+            <w:tcW w:type="dxa" w:w="2000"/>
+            <w:shd w:fill="1F4E79" w:val="clear"/>
+            <w:tcMar>
+              <w:top w:type="dxa" w:w="80"/>
+              <w:left w:type="dxa" w:w="120"/>
+              <w:bottom w:type="dxa" w:w="80"/>
+              <w:right w:type="dxa" w:w="120"/>
+            </w:tcMar>
+          </w:tcPr>
+          <w:p>
+            <w:r>
+              <w:rPr>
+                <w:rFonts w:ascii="Calibri" w:cs="Calibri" w:hAnsi="Calibri"/>
+                <w:b/>
+                <w:color w:val="FFFFFF"/>
+                <w:sz w:val="20"/>
+              </w:rPr>
+              <w:t>Vendor</w:t>
+            </w:r>
+          </w:p>
+        </w:tc>
+        <w:tc>
+          <w:tcPr>
+            <w:tcW w:type="dxa" w:w="7026"/>
+            <w:shd w:fill="DEEAF1" w:val="clear"/>
+            <w:tcMar>
+              <w:top w:type="dxa" w:w="80"/>
+              <w:left w:type="dxa" w:w="120"/>
+              <w:bottom w:type="dxa" w:w="80"/>
+              <w:right w:type="dxa" w:w="120"/>
+            </w:tcMar>
+          </w:tcPr>
+          <w:p>
+            <w:r>
+              <w:rPr>
+                <w:rFonts w:ascii="Calibri" w:cs="Calibri" w:hAnsi="Calibri"/>
+                <w:sz w:val="20"/>
+              </w:rPr>
+              <w:t>Sysdig (USA) · Annuncio: 6 maggio 2026</w:t>
+            </w:r>
+          </w:p>
+        </w:tc>
+      </w:tr>
+      <w:tr>
+        <w:tc>
+          <w:tcPr>
+            <w:tcW w:type="dxa" w:w="2000"/>
+            <w:shd w:fill="1F4E79" w:val="clear"/>
+            <w:tcMar>
+              <w:top w:type="dxa" w:w="80"/>
+              <w:left w:type="dxa" w:w="120"/>
+              <w:bottom w:type="dxa" w:w="80"/>
+              <w:right w:type="dxa" w:w="120"/>
+            </w:tcMar>
+          </w:tcPr>
+          <w:p>
+            <w:r>
+              <w:rPr>
+                <w:rFonts w:ascii="Calibri" w:cs="Calibri" w:hAnsi="Calibri"/>
+                <w:b/>
+                <w:color w:val="FFFFFF"/>
+                <w:sz w:val="20"/>
+              </w:rPr>
+              <w:t>Ambito</w:t>
+            </w:r>
+          </w:p>
+        </w:tc>
+        <w:tc>
+          <w:tcPr>
+            <w:tcW w:type="dxa" w:w="7026"/>
+            <w:shd w:fill="FFFFFF" w:val="clear"/>
+            <w:tcMar>
+              <w:top w:type="dxa" w:w="80"/>
+              <w:left w:type="dxa" w:w="120"/>
+              <w:bottom w:type="dxa" w:w="80"/>
+              <w:right w:type="dxa" w:w="120"/>
+            </w:tcMar>
+          </w:tcPr>
+          <w:p>
+            <w:r>
+              <w:rPr>
+                <w:rFonts w:ascii="Calibri" w:cs="Calibri" w:hAnsi="Calibri"/>
+                <w:sz w:val="20"/>
+              </w:rPr>
+              <w:t>Cloud &amp; Infrastructure Security (CNAPP / AI-Driven)</w:t>
+            </w:r>
+          </w:p>
+        </w:tc>
+      </w:tr>
+      <w:tr>
+        <w:tc>
+          <w:tcPr>
+            <w:tcW w:type="dxa" w:w="2000"/>
+            <w:shd w:fill="1F4E79" w:val="clear"/>
+            <w:tcMar>
+              <w:top w:type="dxa" w:w="80"/>
+              <w:left w:type="dxa" w:w="120"/>
+              <w:bottom w:type="dxa" w:w="80"/>
+              <w:right w:type="dxa" w:w="120"/>
+            </w:tcMar>
+          </w:tcPr>
+          <w:p>
+            <w:r>
+              <w:rPr>
+                <w:rFonts w:ascii="Calibri" w:cs="Calibri" w:hAnsi="Calibri"/>
+                <w:b/>
+                <w:color w:val="FFFFFF"/>
+                <w:sz w:val="20"/>
+              </w:rPr>
+              <w:t>Cosa fa</w:t>
+            </w:r>
+          </w:p>
+        </w:tc>
+        <w:tc>
+          <w:tcPr>
+            <w:tcW w:type="dxa" w:w="7026"/>
+            <w:shd w:fill="DEEAF1" w:val="clear"/>
+            <w:tcMar>
+              <w:top w:type="dxa" w:w="80"/>
+              <w:left w:type="dxa" w:w="120"/>
+              <w:bottom w:type="dxa" w:w="80"/>
+              <w:right w:type="dxa" w:w="120"/>
+            </w:tcMar>
+          </w:tcPr>
+          <w:p>
+            <w:r>
+              <w:rPr>
+                <w:rFonts w:ascii="Calibri" w:cs="Calibri" w:hAnsi="Calibri"/>
+                <w:sz w:val="20"/>
+              </w:rPr>
+              <w:t xml:space="preserve">Prima piattaforma CNAPP “headless” al mondo: integra la sicurezza cloud direttamente negli AI coding agent (Claude Code, Codex, Cursor), CLI, MCP services e API. Gli agenti AI investigano vulnerabilità, prioritizzano rischi e generano fix — senza dashboard tradizionali.</w:t>
+            </w:r>
+          </w:p>
+        </w:tc>
+      </w:tr>
+      <w:tr>
+        <w:tc>
+          <w:tcPr>
+            <w:tcW w:type="dxa" w:w="2000"/>
+            <w:shd w:fill="1F4E79" w:val="clear"/>
+            <w:tcMar>
+              <w:top w:type="dxa" w:w="80"/>
+              <w:left w:type="dxa" w:w="120"/>
+              <w:bottom w:type="dxa" w:w="80"/>
+              <w:right w:type="dxa" w:w="120"/>
+            </w:tcMar>
+          </w:tcPr>
+          <w:p>
+            <w:r>
+              <w:rPr>
+                <w:rFonts w:ascii="Calibri" w:cs="Calibri" w:hAnsi="Calibri"/>
+                <w:b/>
+                <w:color w:val="FFFFFF"/>
+                <w:sz w:val="20"/>
+              </w:rPr>
+              <w:t>Caratteristiche</w:t>
+            </w:r>
+          </w:p>
+        </w:tc>
+        <w:tc>
+          <w:tcPr>
+            <w:tcW w:type="dxa" w:w="7026"/>
+            <w:shd w:fill="FFFFFF" w:val="clear"/>
+            <w:tcMar>
+              <w:top w:type="dxa" w:w="80"/>
+              <w:left w:type="dxa" w:w="120"/>
+              <w:bottom w:type="dxa" w:w="80"/>
+              <w:right w:type="dxa" w:w="120"/>
+            </w:tcMar>
+          </w:tcPr>
+          <w:p>
+            <w:r>
+              <w:rPr>
+                <w:rFonts w:ascii="Calibri" w:cs="Calibri" w:hAnsi="Calibri"/>
+                <w:sz w:val="20"/>
+              </w:rPr>
+              <w:t xml:space="preserve">Vuln Management agentivo con runtime context · Posture Management autonomo · Runtime Threat Investigation · Governance con approvazione umana obbligatoria · SaaS cloud-native multi-cloud (AWS, Azure, GCP) · Integrazione MCP/CLI/API · eBPF-based (Falco)</w:t>
+            </w:r>
+          </w:p>
+        </w:tc>
+      </w:tr>
+      <w:tr>
+        <w:tc>
+          <w:tcPr>
+            <w:tcW w:type="dxa" w:w="2000"/>
+            <w:shd w:fill="1F4E79" w:val="clear"/>
+            <w:tcMar>
+              <w:top w:type="dxa" w:w="80"/>
+              <w:left w:type="dxa" w:w="120"/>
+              <w:bottom w:type="dxa" w:w="80"/>
+              <w:right w:type="dxa" w:w="120"/>
+            </w:tcMar>
+          </w:tcPr>
+          <w:p>
+            <w:r>
+              <w:rPr>
+                <w:rFonts w:ascii="Calibri" w:cs="Calibri" w:hAnsi="Calibri"/>
+                <w:b/>
+                <w:color w:val="FFFFFF"/>
+                <w:sz w:val="20"/>
+              </w:rPr>
+              <w:t>Rilevanza PA</w:t>
+            </w:r>
+          </w:p>
+        </w:tc>
+        <w:tc>
+          <w:tcPr>
+            <w:tcW w:type="dxa" w:w="7026"/>
+            <w:shd w:fill="DEEAF1" w:val="clear"/>
+            <w:tcMar>
+              <w:top w:type="dxa" w:w="80"/>
+              <w:left w:type="dxa" w:w="120"/>
+              <w:bottom w:type="dxa" w:w="80"/>
+              <w:right w:type="dxa" w:w="120"/>
+            </w:tcMar>
+          </w:tcPr>
+          <w:p>
+            <w:r>
+              <w:rPr>
+                <w:rFonts w:ascii="Calibri" w:cs="Calibri" w:hAnsi="Calibri"/>
+                <w:sz w:val="20"/>
+              </w:rPr>
+              <w:t xml:space="preserve">Allineato NIS2 Art. 21 (gestione vuln, supply chain applicativa) · Compatibile con Cloud Qualificato ACN (AWS, Azure) · Governance granulare per requisiti PSNC · Ideale per PA con workload cloud e team DevSecOps</w:t>
+            </w:r>
+          </w:p>
+        </w:tc>
+      </w:tr>
+    </w:tbl>
+    <w:p>
+      <w:pPr>
+        <w:spacing w:after="120" w:before="240"/>
+      </w:pPr>
+    </w:p>
+    <w:p>
+      <w:pPr>
+        <w:pStyle w:val="Heading2"/>
+      </w:pPr>
+      <w:r>
+        <w:rPr>
+          <w:rFonts w:ascii="Calibri" w:cs="Calibri" w:eastAsia="Calibri" w:hAnsi="Calibri"/>
+          <w:b/>
+          <w:color w:val="1F4E79"/>
+          <w:sz w:val="24"/>
+        </w:rPr>
+        <w:t>2. CrowdStrike Falcon Next-Gen Identity Security (+ SGNL)</w:t>
+      </w:r>
+    </w:p>
+    <w:tbl>
+      <w:tblPr>
+        <w:tblW w:type="dxa" w:w="9026"/>
+        <w:tblBorders>
+          <w:top w:val="single" w:color="C9C9C9" w:sz="1"/>
+          <w:left w:val="single" w:color="C9C9C9" w:sz="1"/>
+          <w:bottom w:val="single" w:color="C9C9C9" w:sz="1"/>
+          <w:right w:val="single" w:color="C9C9C9" w:sz="1"/>
+          <w:insideH w:val="single" w:color="C9C9C9" w:sz="1"/>
+          <w:insideV w:val="single" w:color="C9C9C9" w:sz="1"/>
+        </w:tblBorders>
+      </w:tblPr>
+      <w:tblGrid>
+        <w:gridCol w:w="2000"/>
+        <w:gridCol w:w="7026"/>
+      </w:tblGrid>
+      <w:tr>
+        <w:tc>
+          <w:tcPr>
+            <w:tcW w:type="dxa" w:w="2000"/>
+            <w:shd w:fill="1F4E79" w:val="clear"/>
+            <w:tcMar>
+              <w:top w:type="dxa" w:w="80"/>
+              <w:left w:type="dxa" w:w="120"/>
+              <w:bottom w:type="dxa" w:w="80"/>
+              <w:right w:type="dxa" w:w="120"/>
+            </w:tcMar>
+          </w:tcPr>
+          <w:p>
+            <w:r>
+              <w:rPr>
+                <w:rFonts w:ascii="Calibri" w:cs="Calibri" w:hAnsi="Calibri"/>
+                <w:b/>
+                <w:color w:val="FFFFFF"/>
+                <w:sz w:val="20"/>
+              </w:rPr>
+              <w:t>Vendor</w:t>
+            </w:r>
+          </w:p>
+        </w:tc>
+        <w:tc>
+          <w:tcPr>
+            <w:tcW w:type="dxa" w:w="7026"/>
+            <w:shd w:fill="DEEAF1" w:val="clear"/>
+            <w:tcMar>
+              <w:top w:type="dxa" w:w="80"/>
+              <w:left w:type="dxa" w:w="120"/>
+              <w:bottom w:type="dxa" w:w="80"/>
+              <w:right w:type="dxa" w:w="120"/>
+            </w:tcMar>
+          </w:tcPr>
+          <w:p>
+            <w:r>
+              <w:rPr>
+                <w:rFonts w:ascii="Calibri" w:cs="Calibri" w:hAnsi="Calibri"/>
+                <w:sz w:val="20"/>
+              </w:rPr>
+              <w:t>CrowdStrike (USA, NASDAQ: CRWD) · Acq. SGNL $740M: 7 gen 2026 · Leader GigaOm ITDR: 26 mag 2026</w:t>
+            </w:r>
+          </w:p>
+        </w:tc>
+      </w:tr>
+      <w:tr>
+        <w:tc>
+          <w:tcPr>
+            <w:tcW w:type="dxa" w:w="2000"/>
+            <w:shd w:fill="1F4E79" w:val="clear"/>
+            <w:tcMar>
+              <w:top w:type="dxa" w:w="80"/>
+              <w:left w:type="dxa" w:w="120"/>
+              <w:bottom w:type="dxa" w:w="80"/>
+              <w:right w:type="dxa" w:w="120"/>
+            </w:tcMar>
+          </w:tcPr>
+          <w:p>
+            <w:r>
+              <w:rPr>
+                <w:rFonts w:ascii="Calibri" w:cs="Calibri" w:hAnsi="Calibri"/>
+                <w:b/>
+                <w:color w:val="FFFFFF"/>
+                <w:sz w:val="20"/>
+              </w:rPr>
+              <w:t>Ambito</w:t>
+            </w:r>
+          </w:p>
+        </w:tc>
+        <w:tc>
+          <w:tcPr>
+            <w:tcW w:type="dxa" w:w="7026"/>
+            <w:shd w:fill="FFFFFF" w:val="clear"/>
+            <w:tcMar>
+              <w:top w:type="dxa" w:w="80"/>
+              <w:left w:type="dxa" w:w="120"/>
+              <w:bottom w:type="dxa" w:w="80"/>
+              <w:right w:type="dxa" w:w="120"/>
+            </w:tcMar>
+          </w:tcPr>
+          <w:p>
+            <w:r>
+              <w:rPr>
+                <w:rFonts w:ascii="Calibri" w:cs="Calibri" w:hAnsi="Calibri"/>
+                <w:sz w:val="20"/>
+              </w:rPr>
+              <w:t>Endpoint &amp; Identity (ITDR, PAM, Zero Trust)</w:t>
+            </w:r>
+          </w:p>
+        </w:tc>
+      </w:tr>
+      <w:tr>
+        <w:tc>
+          <w:tcPr>
+            <w:tcW w:type="dxa" w:w="2000"/>
+            <w:shd w:fill="1F4E79" w:val="clear"/>
+            <w:tcMar>
+              <w:top w:type="dxa" w:w="80"/>
+              <w:left w:type="dxa" w:w="120"/>
+              <w:bottom w:type="dxa" w:w="80"/>
+              <w:right w:type="dxa" w:w="120"/>
+            </w:tcMar>
+          </w:tcPr>
+          <w:p>
+            <w:r>
+              <w:rPr>
+                <w:rFonts w:ascii="Calibri" w:cs="Calibri" w:hAnsi="Calibri"/>
+                <w:b/>
+                <w:color w:val="FFFFFF"/>
+                <w:sz w:val="20"/>
+              </w:rPr>
+              <w:t>Cosa fa</w:t>
+            </w:r>
+          </w:p>
+        </w:tc>
+        <w:tc>
+          <w:tcPr>
+            <w:tcW w:type="dxa" w:w="7026"/>
+            <w:shd w:fill="DEEAF1" w:val="clear"/>
+            <w:tcMar>
+              <w:top w:type="dxa" w:w="80"/>
+              <w:left w:type="dxa" w:w="120"/>
+              <w:bottom w:type="dxa" w:w="80"/>
+              <w:right w:type="dxa" w:w="120"/>
+            </w:tcMar>
+          </w:tcPr>
+          <w:p>
+            <w:r>
+              <w:rPr>
+                <w:rFonts w:ascii="Calibri" w:cs="Calibri" w:hAnsi="Calibri"/>
+                <w:sz w:val="20"/>
+              </w:rPr>
+              <w:t xml:space="preserve">Con l’acquisizione SGNL introduce Zero Standing Privilege (ZSP): accessi concessi solo quando necessari e revocati immediatamente. Unifica IAM, PAM, ITDR e protezione NHI/AI agent in un’unica piattaforma correlata con telemetria endpoint.</w:t>
+            </w:r>
+          </w:p>
+        </w:tc>
+      </w:tr>
+      <w:tr>
+        <w:tc>
+          <w:tcPr>
+            <w:tcW w:type="dxa" w:w="2000"/>
+            <w:shd w:fill="1F4E79" w:val="clear"/>
+            <w:tcMar>
+              <w:top w:type="dxa" w:w="80"/>
+              <w:left w:type="dxa" w:w="120"/>
+              <w:bottom w:type="dxa" w:w="80"/>
+              <w:right w:type="dxa" w:w="120"/>
+            </w:tcMar>
+          </w:tcPr>
+          <w:p>
+            <w:r>
+              <w:rPr>
+                <w:rFonts w:ascii="Calibri" w:cs="Calibri" w:hAnsi="Calibri"/>
+                <w:b/>
+                <w:color w:val="FFFFFF"/>
+                <w:sz w:val="20"/>
+              </w:rPr>
+              <w:t>Caratteristiche</w:t>
+            </w:r>
+          </w:p>
+        </w:tc>
+        <w:tc>
+          <w:tcPr>
+            <w:tcW w:type="dxa" w:w="7026"/>
+            <w:shd w:fill="FFFFFF" w:val="clear"/>
+            <w:tcMar>
+              <w:top w:type="dxa" w:w="80"/>
+              <w:left w:type="dxa" w:w="120"/>
+              <w:bottom w:type="dxa" w:w="80"/>
+              <w:right w:type="dxa" w:w="120"/>
+            </w:tcMar>
+          </w:tcPr>
+          <w:p>
+            <w:r>
+              <w:rPr>
+                <w:rFonts w:ascii="Calibri" w:cs="Calibri" w:hAnsi="Calibri"/>
+                <w:sz w:val="20"/>
+              </w:rPr>
+              <w:t xml:space="preserve">Just-in-Time access cross-sistema (AD, Entra ID, AWS IAM, Okta) · Protezione NHI (service account, API key, AI agent) · ITDR con AI triage · CAEP enforcement downstream · FalconID FIDO2/passkey · Score 5/5 GigaOm · Leader Frost &amp; Sullivan ITDR 2026</w:t>
+            </w:r>
+          </w:p>
+        </w:tc>
+      </w:tr>
+      <w:tr>
+        <w:tc>
+          <w:tcPr>
+            <w:tcW w:type="dxa" w:w="2000"/>
+            <w:shd w:fill="1F4E79" w:val="clear"/>
+            <w:tcMar>
+              <w:top w:type="dxa" w:w="80"/>
+              <w:left w:type="dxa" w:w="120"/>
+              <w:bottom w:type="dxa" w:w="80"/>
+              <w:right w:type="dxa" w:w="120"/>
+            </w:tcMar>
+          </w:tcPr>
+          <w:p>
+            <w:r>
+              <w:rPr>
+                <w:rFonts w:ascii="Calibri" w:cs="Calibri" w:hAnsi="Calibri"/>
+                <w:b/>
+                <w:color w:val="FFFFFF"/>
+                <w:sz w:val="20"/>
+              </w:rPr>
+              <w:t>Rilevanza PA</w:t>
+            </w:r>
+          </w:p>
+        </w:tc>
+        <w:tc>
+          <w:tcPr>
+            <w:tcW w:type="dxa" w:w="7026"/>
+            <w:shd w:fill="DEEAF1" w:val="clear"/>
+            <w:tcMar>
+              <w:top w:type="dxa" w:w="80"/>
+              <w:left w:type="dxa" w:w="120"/>
+              <w:bottom w:type="dxa" w:w="80"/>
+              <w:right w:type="dxa" w:w="120"/>
+            </w:tcMar>
+          </w:tcPr>
+          <w:p>
+            <w:r>
+              <w:rPr>
+                <w:rFonts w:ascii="Calibri" w:cs="Calibri" w:hAnsi="Calibri"/>
+                <w:sz w:val="20"/>
+              </w:rPr>
+              <w:t xml:space="preserve">NIS2 Art. 21(b) gestione accessi privilegiati · Linee guida ACN/PSNC gestione identità · Protezione NHI strategica per PA con RPA/AI · Maturità certificata per procurement CONSIP/MePa · Ambienti ibridi AD on-premise + cloud</w:t>
+            </w:r>
+          </w:p>
+        </w:tc>
+      </w:tr>
+    </w:tbl>
+    <w:p>
+      <w:pPr>
+        <w:spacing w:after="120" w:before="240"/>
+      </w:pPr>
+    </w:p>
+    <w:p>
+      <w:pPr>
+        <w:pStyle w:val="Heading2"/>
+      </w:pPr>
+      <w:r>
+        <w:rPr>
+          <w:rFonts w:ascii="Calibri" w:cs="Calibri" w:eastAsia="Calibri" w:hAnsi="Calibri"/>
+          <w:b/>
+          <w:color w:val="1F4E79"/>
+          <w:sz w:val="24"/>
+        </w:rPr>
+        <w:t>3. Nozomi Networks Vantage IQ — Update Q2 2026</w:t>
+      </w:r>
+    </w:p>
+    <w:tbl>
+      <w:tblPr>
+        <w:tblW w:type="dxa" w:w="9026"/>
+        <w:tblBorders>
+          <w:top w:val="single" w:color="C9C9C9" w:sz="1"/>
+          <w:left w:val="single" w:color="C9C9C9" w:sz="1"/>
+          <w:bottom w:val="single" w:color="C9C9C9" w:sz="1"/>
+          <w:right w:val="single" w:color="C9C9C9" w:sz="1"/>
+          <w:insideH w:val="single" w:color="C9C9C9" w:sz="1"/>
+          <w:insideV w:val="single" w:color="C9C9C9" w:sz="1"/>
+        </w:tblBorders>
+      </w:tblPr>
+      <w:tblGrid>
+        <w:gridCol w:w="2000"/>
+        <w:gridCol w:w="7026"/>
+      </w:tblGrid>
+      <w:tr>
+        <w:tc>
+          <w:tcPr>
+            <w:tcW w:type="dxa" w:w="2000"/>
+            <w:shd w:fill="1F4E79" w:val="clear"/>
+            <w:tcMar>
+              <w:top w:type="dxa" w:w="80"/>
+              <w:left w:type="dxa" w:w="120"/>
+              <w:bottom w:type="dxa" w:w="80"/>
+              <w:right w:type="dxa" w:w="120"/>
+            </w:tcMar>
+          </w:tcPr>
+          <w:p>
+            <w:r>
+              <w:rPr>
+                <w:rFonts w:ascii="Calibri" w:cs="Calibri" w:hAnsi="Calibri"/>
+                <w:b/>
+                <w:color w:val="FFFFFF"/>
+                <w:sz w:val="20"/>
+              </w:rPr>
+              <w:t>Vendor</w:t>
+            </w:r>
+          </w:p>
+        </w:tc>
+        <w:tc>
+          <w:tcPr>
+            <w:tcW w:type="dxa" w:w="7026"/>
+            <w:shd w:fill="DEEAF1" w:val="clear"/>
+            <w:tcMar>
+              <w:top w:type="dxa" w:w="80"/>
+              <w:left w:type="dxa" w:w="120"/>
+              <w:bottom w:type="dxa" w:w="80"/>
+              <w:right w:type="dxa" w:w="120"/>
+            </w:tcMar>
+          </w:tcPr>
+          <w:p>
+            <w:r>
+              <w:rPr>
+                <w:rFonts w:ascii="Calibri" w:cs="Calibri" w:hAnsi="Calibri"/>
+                <w:sz w:val="20"/>
+              </w:rPr>
+              <w:t>Nozomi Networks (USA/Svizzera, uffici diretti in Italia) · Vantage IQ: 15 gen 2026 · Q2 update: mag/giu 2026</w:t>
+            </w:r>
+          </w:p>
+        </w:tc>
+      </w:tr>
+      <w:tr>
+        <w:tc>
+          <w:tcPr>
+            <w:tcW w:type="dxa" w:w="2000"/>
+            <w:shd w:fill="1F4E79" w:val="clear"/>
+            <w:tcMar>
+              <w:top w:type="dxa" w:w="80"/>
+              <w:left w:type="dxa" w:w="120"/>
+              <w:bottom w:type="dxa" w:w="80"/>
+              <w:right w:type="dxa" w:w="120"/>
+            </w:tcMar>
+          </w:tcPr>
+          <w:p>
+            <w:r>
+              <w:rPr>
+                <w:rFonts w:ascii="Calibri" w:cs="Calibri" w:hAnsi="Calibri"/>
+                <w:b/>
+                <w:color w:val="FFFFFF"/>
+                <w:sz w:val="20"/>
+              </w:rPr>
+              <w:t>Ambito</w:t>
+            </w:r>
+          </w:p>
+        </w:tc>
+        <w:tc>
+          <w:tcPr>
+            <w:tcW w:type="dxa" w:w="7026"/>
+            <w:shd w:fill="FFFFFF" w:val="clear"/>
+            <w:tcMar>
+              <w:top w:type="dxa" w:w="80"/>
+              <w:left w:type="dxa" w:w="120"/>
+              <w:bottom w:type="dxa" w:w="80"/>
+              <w:right w:type="dxa" w:w="120"/>
+            </w:tcMar>
+          </w:tcPr>
+          <w:p>
+            <w:r>
+              <w:rPr>
+                <w:rFonts w:ascii="Calibri" w:cs="Calibri" w:hAnsi="Calibri"/>
+                <w:sz w:val="20"/>
+              </w:rPr>
+              <w:t>OT/IoT &amp; Infrastrutture Critiche</w:t>
+            </w:r>
+          </w:p>
+        </w:tc>
+      </w:tr>
+      <w:tr>
+        <w:tc>
+          <w:tcPr>
+            <w:tcW w:type="dxa" w:w="2000"/>
+            <w:shd w:fill="1F4E79" w:val="clear"/>
+            <w:tcMar>
+              <w:top w:type="dxa" w:w="80"/>
+              <w:left w:type="dxa" w:w="120"/>
+              <w:bottom w:type="dxa" w:w="80"/>
+              <w:right w:type="dxa" w:w="120"/>
+            </w:tcMar>
+          </w:tcPr>
+          <w:p>
+            <w:r>
+              <w:rPr>
+                <w:rFonts w:ascii="Calibri" w:cs="Calibri" w:hAnsi="Calibri"/>
+                <w:b/>
+                <w:color w:val="FFFFFF"/>
+                <w:sz w:val="20"/>
+              </w:rPr>
+              <w:t>Cosa fa</w:t>
+            </w:r>
+          </w:p>
+        </w:tc>
+        <w:tc>
+          <w:tcPr>
+            <w:tcW w:type="dxa" w:w="7026"/>
+            <w:shd w:fill="DEEAF1" w:val="clear"/>
+            <w:tcMar>
+              <w:top w:type="dxa" w:w="80"/>
+              <w:left w:type="dxa" w:w="120"/>
+              <w:bottom w:type="dxa" w:w="80"/>
+              <w:right w:type="dxa" w:w="120"/>
+            </w:tcMar>
+          </w:tcPr>
+          <w:p>
+            <w:r>
+              <w:rPr>
+                <w:rFonts w:ascii="Calibri" w:cs="Calibri" w:hAnsi="Calibri"/>
+                <w:sz w:val="20"/>
+              </w:rPr>
+              <w:t xml:space="preserve">Vantage IQ è il primo assistente AI privato al mondo per OT/IoT security. Il Q2 2026 update introduce AI Integration Builder (costruisce integrazioni bidirezionali in giorni, non settimane) e Guardian Air per visibilità full-spectrum RF.</w:t>
+            </w:r>
+          </w:p>
+        </w:tc>
+      </w:tr>
+      <w:tr>
+        <w:tc>
+          <w:tcPr>
+            <w:tcW w:type="dxa" w:w="2000"/>
+            <w:shd w:fill="1F4E79" w:val="clear"/>
+            <w:tcMar>
+              <w:top w:type="dxa" w:w="80"/>
+              <w:left w:type="dxa" w:w="120"/>
+              <w:bottom w:type="dxa" w:w="80"/>
+              <w:right w:type="dxa" w:w="120"/>
+            </w:tcMar>
+          </w:tcPr>
+          <w:p>
+            <w:r>
+              <w:rPr>
+                <w:rFonts w:ascii="Calibri" w:cs="Calibri" w:hAnsi="Calibri"/>
+                <w:b/>
+                <w:color w:val="FFFFFF"/>
+                <w:sz w:val="20"/>
+              </w:rPr>
+              <w:t>Caratteristiche</w:t>
+            </w:r>
+          </w:p>
+        </w:tc>
+        <w:tc>
+          <w:tcPr>
+            <w:tcW w:type="dxa" w:w="7026"/>
+            <w:shd w:fill="FFFFFF" w:val="clear"/>
+            <w:tcMar>
+              <w:top w:type="dxa" w:w="80"/>
+              <w:left w:type="dxa" w:w="120"/>
+              <w:bottom w:type="dxa" w:w="80"/>
+              <w:right w:type="dxa" w:w="120"/>
+            </w:tcMar>
+          </w:tcPr>
+          <w:p>
+            <w:r>
+              <w:rPr>
+                <w:rFonts w:ascii="Calibri" w:cs="Calibri" w:hAnsi="Calibri"/>
+                <w:sz w:val="20"/>
+              </w:rPr>
+              <w:t xml:space="preserve">LLM privato addestrato su dati OT dell’org · AI triage e investigation guidato · Integration Builder AI-powered (30+ integr. in Q1 2026) · Guardian Air: RF spectrum (Zigbee, LoRa, BLE, 802.15.4) · Passive monitoring agentless · Board-ready reporting · Disponibile su Google Cloud Marketplace</w:t>
+            </w:r>
+          </w:p>
+        </w:tc>
+      </w:tr>
+      <w:tr>
+        <w:tc>
+          <w:tcPr>
+            <w:tcW w:type="dxa" w:w="2000"/>
+            <w:shd w:fill="1F4E79" w:val="clear"/>
+            <w:tcMar>
+              <w:top w:type="dxa" w:w="80"/>
+              <w:left w:type="dxa" w:w="120"/>
+              <w:bottom w:type="dxa" w:w="80"/>
+              <w:right w:type="dxa" w:w="120"/>
+            </w:tcMar>
+          </w:tcPr>
+          <w:p>
+            <w:r>
+              <w:rPr>
+                <w:rFonts w:ascii="Calibri" w:cs="Calibri" w:hAnsi="Calibri"/>
+                <w:b/>
+                <w:color w:val="FFFFFF"/>
+                <w:sz w:val="20"/>
+              </w:rPr>
+              <w:t>Rilevanza PA</w:t>
+            </w:r>
+          </w:p>
+        </w:tc>
+        <w:tc>
+          <w:tcPr>
+            <w:tcW w:type="dxa" w:w="7026"/>
+            <w:shd w:fill="DEEAF1" w:val="clear"/>
+            <w:tcMar>
+              <w:top w:type="dxa" w:w="80"/>
+              <w:left w:type="dxa" w:w="120"/>
+              <w:bottom w:type="dxa" w:w="80"/>
+              <w:right w:type="dxa" w:w="120"/>
+            </w:tcMar>
+          </w:tcPr>
+          <w:p>
+            <w:r>
+              <w:rPr>
+                <w:rFonts w:ascii="Calibri" w:cs="Calibri" w:hAnsi="Calibri"/>
+                <w:sz w:val="20"/>
+              </w:rPr>
+              <w:t xml:space="preserve">Inventario asset OT richiesto da NIS2/ACN (scadenza 30 giu 2026) · PSNC: energia, sanità, trasporti priorità assoluta · Integration Builder accelera deploy con SIEM PA esistenti · GSE, Terna, RFI, ENAV, SSN: target primario · Dati OT mai fuori dall’ambiente (LLM privato)</w:t>
+            </w:r>
+          </w:p>
+        </w:tc>
+      </w:tr>
+    </w:tbl>
+    <w:p>
+      <w:pPr>
+        <w:spacing w:after="120" w:before="240"/>
+      </w:pPr>
+    </w:p>
+    <w:p>
+      <w:pPr>
+        <w:pStyle w:val="Heading2"/>
+      </w:pPr>
+      <w:r>
+        <w:rPr>
+          <w:rFonts w:ascii="Calibri" w:cs="Calibri" w:eastAsia="Calibri" w:hAnsi="Calibri"/>
+          <w:b/>
+          <w:color w:val="1F4E79"/>
+          <w:sz w:val="24"/>
+        </w:rPr>
+        <w:t>Segnali da tenere d’occhio</w:t>
+      </w:r>
+    </w:p>
+    <w:tbl>
+      <w:tblPr>
+        <w:tblW w:type="dxa" w:w="9026"/>
+        <w:tblBorders>
+          <w:top w:val="single" w:color="C9C9C9" w:sz="1"/>
+          <w:left w:val="single" w:color="C9C9C9" w:sz="1"/>
+          <w:bottom w:val="single" w:color="C9C9C9" w:sz="1"/>
+          <w:right w:val="single" w:color="C9C9C9" w:sz="1"/>
+          <w:insideH w:val="single" w:color="C9C9C9" w:sz="1"/>
+          <w:insideV w:val="single" w:color="C9C9C9" w:sz="1"/>
+        </w:tblBorders>
+      </w:tblPr>
+      <w:tblGrid>
+        <w:gridCol w:w="3500"/>
+        <w:gridCol w:w="3500"/>
+        <w:gridCol w:w="2026"/>
+      </w:tblGrid>
+      <w:tr>
+        <w:tc>
+          <w:tcPr>
+            <w:tcW w:type="dxa" w:w="3500"/>
+            <w:shd w:fill="1F4E79" w:val="clear"/>
+            <w:tcMar>
+              <w:top w:type="dxa" w:w="80"/>
+              <w:left w:type="dxa" w:w="120"/>
+              <w:bottom w:type="dxa" w:w="80"/>
+              <w:right w:type="dxa" w:w="120"/>
+            </w:tcMar>
+          </w:tcPr>
+          <w:p>
+            <w:r>
+              <w:rPr>
+                <w:rFonts w:ascii="Calibri" w:cs="Calibri" w:hAnsi="Calibri"/>
+                <w:b/>
+                <w:color w:val="FFFFFF"/>
+                <w:sz w:val="20"/>
+              </w:rPr>
+              <w:t>Segnale</w:t>
+            </w:r>
+          </w:p>
+        </w:tc>
+        <w:tc>
+          <w:tcPr>
+            <w:tcW w:type="dxa" w:w="3500"/>
+            <w:shd w:fill="1F4E79" w:val="clear"/>
+            <w:tcMar>
+              <w:top w:type="dxa" w:w="80"/>
+              <w:left w:type="dxa" w:w="120"/>
+              <w:bottom w:type="dxa" w:w="80"/>
+              <w:right w:type="dxa" w:w="120"/>
+            </w:tcMar>
+          </w:tcPr>
+          <w:p>
+            <w:r>
+              <w:rPr>
+                <w:rFonts w:ascii="Calibri" w:cs="Calibri" w:hAnsi="Calibri"/>
+                <w:b/>
+                <w:color w:val="FFFFFF"/>
+                <w:sz w:val="20"/>
+              </w:rPr>
+              <w:t>Impatto atteso</w:t>
+            </w:r>
+          </w:p>
+        </w:tc>
+        <w:tc>
+          <w:tcPr>
+            <w:tcW w:type="dxa" w:w="2026"/>
+            <w:shd w:fill="1F4E79" w:val="clear"/>
+            <w:tcMar>
+              <w:top w:type="dxa" w:w="80"/>
+              <w:left w:type="dxa" w:w="120"/>
+              <w:bottom w:type="dxa" w:w="80"/>
+              <w:right w:type="dxa" w:w="120"/>
+            </w:tcMar>
+          </w:tcPr>
+          <w:p>
+            <w:r>
+              <w:rPr>
+                <w:rFonts w:ascii="Calibri" w:cs="Calibri" w:hAnsi="Calibri"/>
+                <w:b/>
+                <w:color w:val="FFFFFF"/>
+                <w:sz w:val="20"/>
+              </w:rPr>
+              <w:t>Orizzonte</w:t>
+            </w:r>
+          </w:p>
+        </w:tc>
+      </w:tr>
+      <w:tr>
+        <w:tc>
+          <w:tcPr>
+            <w:tcW w:type="dxa" w:w="3500"/>
+            <w:shd w:fill="DEEAF1" w:val="clear"/>
+            <w:tcMar>
+              <w:top w:type="dxa" w:w="80"/>
+              <w:left w:type="dxa" w:w="120"/>
+              <w:bottom w:type="dxa" w:w="80"/>
+              <w:right w:type="dxa" w:w="120"/>
+            </w:tcMar>
+          </w:tcPr>
+          <w:p>
+            <w:r>
+              <w:rPr>
+                <w:rFonts w:ascii="Calibri" w:cs="Calibri" w:hAnsi="Calibri"/>
+                <w:sz w:val="20"/>
+              </w:rPr>
+              <w:t>Scadenza NIS2/ACN categorizzazione 30 giu 2026</w:t>
+            </w:r>
+          </w:p>
+        </w:tc>
+        <w:tc>
+          <w:tcPr>
+            <w:tcW w:type="dxa" w:w="3500"/>
+            <w:shd w:fill="FFFFFF" w:val="clear"/>
+            <w:tcMar>
+              <w:top w:type="dxa" w:w="80"/>
+              <w:left w:type="dxa" w:w="120"/>
+              <w:bottom w:type="dxa" w:w="80"/>
+              <w:right w:type="dxa" w:w="120"/>
+            </w:tcMar>
+          </w:tcPr>
+          <w:p>
+            <w:r>
+              <w:rPr>
+                <w:rFonts w:ascii="Calibri" w:cs="Calibri" w:hAnsi="Calibri"/>
+                <w:sz w:val="20"/>
+              </w:rPr>
+              <w:t>Accelerazione acquisti tool inventory/assessment PA</w:t>
+            </w:r>
+          </w:p>
+        </w:tc>
+        <w:tc>
+          <w:tcPr>
+            <w:tcW w:type="dxa" w:w="2026"/>
+            <w:shd w:fill="DEEAF1" w:val="clear"/>
+            <w:tcMar>
+              <w:top w:type="dxa" w:w="80"/>
+              <w:left w:type="dxa" w:w="120"/>
+              <w:bottom w:type="dxa" w:w="80"/>
+              <w:right w:type="dxa" w:w="120"/>
+            </w:tcMar>
+          </w:tcPr>
+          <w:p>
+            <w:r>
+              <w:rPr>
+                <w:rFonts w:ascii="Calibri" w:cs="Calibri" w:hAnsi="Calibri"/>
+                <w:sz w:val="20"/>
+              </w:rPr>
+              <w:t>Immediato</w:t>
+            </w:r>
+          </w:p>
+        </w:tc>
+      </w:tr>
+      <w:tr>
+        <w:tc>
+          <w:tcPr>
+            <w:tcW w:type="dxa" w:w="3500"/>
+            <w:shd w:fill="DEEAF1" w:val="clear"/>
+            <w:tcMar>
+              <w:top w:type="dxa" w:w="80"/>
+              <w:left w:type="dxa" w:w="120"/>
+              <w:bottom w:type="dxa" w:w="80"/>
+              <w:right w:type="dxa" w:w="120"/>
+            </w:tcMar>
+          </w:tcPr>
+          <w:p>
+            <w:r>
+              <w:rPr>
+                <w:rFonts w:ascii="Calibri" w:cs="Calibri" w:hAnsi="Calibri"/>
+                <w:sz w:val="20"/>
+              </w:rPr>
+              <w:t>Forum PA 2026 (9-11 giu, Roma) — ACN roadmap linee guida settoriali</w:t>
+            </w:r>
+          </w:p>
+        </w:tc>
+        <w:tc>
+          <w:tcPr>
+            <w:tcW w:type="dxa" w:w="3500"/>
+            <w:shd w:fill="FFFFFF" w:val="clear"/>
+            <w:tcMar>
+              <w:top w:type="dxa" w:w="80"/>
+              <w:left w:type="dxa" w:w="120"/>
+              <w:bottom w:type="dxa" w:w="80"/>
+              <w:right w:type="dxa" w:w="120"/>
+            </w:tcMar>
+          </w:tcPr>
+          <w:p>
+            <w:r>
+              <w:rPr>
+                <w:rFonts w:ascii="Calibri" w:cs="Calibri" w:hAnsi="Calibri"/>
+                <w:sz w:val="20"/>
+              </w:rPr>
+              <w:t>Nuovi requisiti tecnici settoriali in arrivo</w:t>
+            </w:r>
+          </w:p>
+        </w:tc>
+        <w:tc>
+          <w:tcPr>
+            <w:tcW w:type="dxa" w:w="2026"/>
+            <w:shd w:fill="DEEAF1" w:val="clear"/>
+            <w:tcMar>
+              <w:top w:type="dxa" w:w="80"/>
+              <w:left w:type="dxa" w:w="120"/>
+              <w:bottom w:type="dxa" w:w="80"/>
+              <w:right w:type="dxa" w:w="120"/>
+            </w:tcMar>
+          </w:tcPr>
+          <w:p>
+            <w:r>
+              <w:rPr>
+                <w:rFonts w:ascii="Calibri" w:cs="Calibri" w:hAnsi="Calibri"/>
+                <w:sz w:val="20"/>
+              </w:rPr>
+              <w:t>Questa settimana</w:t>
+            </w:r>
+          </w:p>
+        </w:tc>
+      </w:tr>
+      <w:tr>
+        <w:tc>
+          <w:tcPr>
+            <w:tcW w:type="dxa" w:w="3500"/>
+            <w:shd w:fill="DEEAF1" w:val="clear"/>
+            <w:tcMar>
+              <w:top w:type="dxa" w:w="80"/>
+              <w:left w:type="dxa" w:w="120"/>
+              <w:bottom w:type="dxa" w:w="80"/>
+              <w:right w:type="dxa" w:w="120"/>
+            </w:tcMar>
+          </w:tcPr>
+          <w:p>
+            <w:r>
+              <w:rPr>
+                <w:rFonts w:ascii="Calibri" w:cs="Calibri" w:hAnsi="Calibri"/>
+                <w:sz w:val="20"/>
+              </w:rPr>
+              <w:t>Zero Standing Privilege come nuovo standard: pressione su PAM tradizionali</w:t>
+            </w:r>
+          </w:p>
+        </w:tc>
+        <w:tc>
+          <w:tcPr>
+            <w:tcW w:type="dxa" w:w="3500"/>
+            <w:shd w:fill="FFFFFF" w:val="clear"/>
+            <w:tcMar>
+              <w:top w:type="dxa" w:w="80"/>
+              <w:left w:type="dxa" w:w="120"/>
+              <w:bottom w:type="dxa" w:w="80"/>
+              <w:right w:type="dxa" w:w="120"/>
+            </w:tcMar>
+          </w:tcPr>
+          <w:p>
+            <w:r>
+              <w:rPr>
+                <w:rFonts w:ascii="Calibri" w:cs="Calibri" w:hAnsi="Calibri"/>
+                <w:sz w:val="20"/>
+              </w:rPr>
+              <w:t>Possibile sostituzione CyberArk/BeyondTrust in favore di soluzioni dinamiche</w:t>
+            </w:r>
+          </w:p>
+        </w:tc>
+        <w:tc>
+          <w:tcPr>
+            <w:tcW w:type="dxa" w:w="2026"/>
+            <w:shd w:fill="DEEAF1" w:val="clear"/>
+            <w:tcMar>
+              <w:top w:type="dxa" w:w="80"/>
+              <w:left w:type="dxa" w:w="120"/>
+              <w:bottom w:type="dxa" w:w="80"/>
+              <w:right w:type="dxa" w:w="120"/>
+            </w:tcMar>
+          </w:tcPr>
+          <w:p>
+            <w:r>
+              <w:rPr>
+                <w:rFonts w:ascii="Calibri" w:cs="Calibri" w:hAnsi="Calibri"/>
+                <w:sz w:val="20"/>
+              </w:rPr>
+              <w:t>12-18 mesi</w:t>
+            </w:r>
+          </w:p>
+        </w:tc>
+      </w:tr>
+    </w:tbl>
+    <w:p>
+      <w:pPr>
+        <w:spacing w:after="120" w:before="240"/>
+      </w:pPr>
+    </w:p>
+    <w:p>
+      <w:pPr>
+        <w:spacing w:after="60" w:before="60"/>
+        <w:jc w:val="center"/>
+      </w:pPr>
+      <w:r>
+        <w:rPr>
+          <w:rFonts w:ascii="Calibri" w:cs="Calibri" w:eastAsia="Calibri" w:hAnsi="Calibri"/>
+          <w:i/>
+          <w:color w:val="595959"/>
+          <w:sz w:val="18"/>
+        </w:rPr>
+        <w:t xml:space="preserve">Prossimo briefing: 14 giugno 2026 · Generato automaticamente da Claude · Cowork</w:t>
+      </w:r>
     </w:p>
     <w:p>
       <w:r>

</xml_diff>

<commit_message>
Update diario W25 - 2026-06-15
</commit_message>
<xml_diff>
--- a/diario-cybersecurity-2026.docx
+++ b/diario-cybersecurity-2026.docx
@@ -111,6 +111,22 @@
       <w:pPr>
         <w:spacing w:after="60" w:before="120"/>
       </w:pPr>
+      <w:hyperlink w:history="1" w:anchor="bm_w24">
+        <w:r>
+          <w:rPr>
+            <w:rStyle w:val="Hyperlink"/>
+            <w:rFonts w:ascii="Calibri" w:cs="Calibri" w:eastAsia="Calibri" w:hAnsi="Calibri"/>
+            <w:sz w:val="22"/>
+            <w:szCs w:val="22"/>
+          </w:rPr>
+          <w:t xml:space="preserve">W24 · 15 giugno 2026 — Censys SOC Integrations · SentinelOne Purple AI Agentic · Sysdig CNAPP Forrester Leader</w:t>
+        </w:r>
+      </w:hyperlink>
+    </w:p>
+    <w:p>
+      <w:pPr>
+        <w:spacing w:after="60" w:before="120"/>
+      </w:pPr>
       <w:hyperlink w:history="1" w:anchor="bm_w23">
         <w:r>
           <w:rPr>
@@ -170,6 +186,1143 @@
           <w:t xml:space="preserve">W21 · 21 maggio 2026 — Idira (PANW) · Sysdig Headless Cloud Security · Dragos Platform 3.1</w:t>
         </w:r>
       </w:hyperlink>
+    </w:p>
+    <w:p>
+      <w:r>
+        <w:br w:type="page"/>
+      </w:r>
+    </w:p>
+    <w:p>
+      <w:pPr>
+        <w:pStyle w:val="Heading1"/>
+      </w:pPr>
+      <w:bookmarkStart w:name="bm_w24" w:id="400"/>
+      <w:r>
+        <w:rPr>
+          <w:rFonts w:ascii="Calibri" w:cs="Calibri" w:eastAsia="Calibri" w:hAnsi="Calibri"/>
+          <w:b/>
+          <w:bCs/>
+          <w:color w:val="1F4E79"/>
+          <w:sz w:val="28"/>
+          <w:szCs w:val="28"/>
+        </w:rPr>
+        <w:t xml:space="preserve">W24 · 15 giugno 2026</w:t>
+      </w:r>
+      <w:bookmarkEnd w:id="400"/>
+    </w:p>
+    <w:tbl>
+      <w:tblPr>
+        <w:tblW w:type="dxa" w:w="9026"/>
+        <w:tblBorders>
+          <w:top w:val="single" w:color="auto" w:sz="4"/>
+          <w:left w:val="single" w:color="auto" w:sz="4"/>
+          <w:bottom w:val="single" w:color="auto" w:sz="4"/>
+          <w:right w:val="single" w:color="auto" w:sz="4"/>
+          <w:insideH w:val="single" w:color="auto" w:sz="4"/>
+          <w:insideV w:val="single" w:color="auto" w:sz="4"/>
+        </w:tblBorders>
+      </w:tblPr>
+      <w:tblGrid>
+        <w:gridCol w:w="2252"/>
+        <w:gridCol w:w="2252"/>
+        <w:gridCol w:w="2251"/>
+        <w:gridCol w:w="2271"/>
+      </w:tblGrid>
+      <w:tr>
+        <w:tc>
+          <w:tcPr>
+            <w:tcW w:type="dxa" w:w="2252"/>
+            <w:tcBorders>
+              <w:top w:val="single" w:color="C9C9C9" w:sz="1"/>
+              <w:left w:val="single" w:color="C9C9C9" w:sz="1"/>
+              <w:bottom w:val="single" w:color="C9C9C9" w:sz="1"/>
+              <w:right w:val="single" w:color="C9C9C9" w:sz="1"/>
+            </w:tcBorders>
+            <w:shd w:fill="DEEAF1" w:val="clear"/>
+            <w:tcMar>
+              <w:top w:type="dxa" w:w="80"/>
+              <w:left w:type="dxa" w:w="120"/>
+              <w:bottom w:type="dxa" w:w="80"/>
+              <w:right w:type="dxa" w:w="120"/>
+            </w:tcMar>
+          </w:tcPr>
+          <w:p>
+            <w:r>
+              <w:rPr>
+                <w:rFonts w:ascii="Calibri" w:cs="Calibri" w:eastAsia="Calibri" w:hAnsi="Calibri"/>
+                <w:b/>
+                <w:color w:val="1F4E79"/>
+                <w:sz w:val="20"/>
+              </w:rPr>
+              <w:t>Data</w:t>
+            </w:r>
+          </w:p>
+          <w:p>
+            <w:r>
+              <w:rPr>
+                <w:rFonts w:ascii="Calibri" w:cs="Calibri" w:eastAsia="Calibri" w:hAnsi="Calibri"/>
+                <w:sz w:val="20"/>
+              </w:rPr>
+              <w:t>15 giugno 2026</w:t>
+            </w:r>
+          </w:p>
+        </w:tc>
+        <w:tc>
+          <w:tcPr>
+            <w:tcW w:type="dxa" w:w="2252"/>
+            <w:tcBorders>
+              <w:top w:val="single" w:color="C9C9C9" w:sz="1"/>
+              <w:left w:val="single" w:color="C9C9C9" w:sz="1"/>
+              <w:bottom w:val="single" w:color="C9C9C9" w:sz="1"/>
+              <w:right w:val="single" w:color="C9C9C9" w:sz="1"/>
+            </w:tcBorders>
+            <w:shd w:fill="DEEAF1" w:val="clear"/>
+            <w:tcMar>
+              <w:top w:type="dxa" w:w="80"/>
+              <w:left w:type="dxa" w:w="120"/>
+              <w:bottom w:type="dxa" w:w="80"/>
+              <w:right w:type="dxa" w:w="120"/>
+            </w:tcMar>
+          </w:tcPr>
+          <w:p>
+            <w:r>
+              <w:rPr>
+                <w:rFonts w:ascii="Calibri" w:cs="Calibri" w:eastAsia="Calibri" w:hAnsi="Calibri"/>
+                <w:b/>
+                <w:color w:val="1F4E79"/>
+                <w:sz w:val="20"/>
+              </w:rPr>
+              <w:t>Settimana</w:t>
+            </w:r>
+          </w:p>
+          <w:p>
+            <w:r>
+              <w:rPr>
+                <w:rFonts w:ascii="Calibri" w:cs="Calibri" w:eastAsia="Calibri" w:hAnsi="Calibri"/>
+                <w:sz w:val="20"/>
+              </w:rPr>
+              <w:t>W24 2026</w:t>
+            </w:r>
+          </w:p>
+        </w:tc>
+        <w:tc>
+          <w:tcPr>
+            <w:tcW w:type="dxa" w:w="2251"/>
+            <w:tcBorders>
+              <w:top w:val="single" w:color="C9C9C9" w:sz="1"/>
+              <w:left w:val="single" w:color="C9C9C9" w:sz="1"/>
+              <w:bottom w:val="single" w:color="C9C9C9" w:sz="1"/>
+              <w:right w:val="single" w:color="C9C9C9" w:sz="1"/>
+            </w:tcBorders>
+            <w:shd w:fill="DEEAF1" w:val="clear"/>
+            <w:tcMar>
+              <w:top w:type="dxa" w:w="80"/>
+              <w:left w:type="dxa" w:w="120"/>
+              <w:bottom w:type="dxa" w:w="80"/>
+              <w:right w:type="dxa" w:w="120"/>
+            </w:tcMar>
+          </w:tcPr>
+          <w:p>
+            <w:r>
+              <w:rPr>
+                <w:rFonts w:ascii="Calibri" w:cs="Calibri" w:eastAsia="Calibri" w:hAnsi="Calibri"/>
+                <w:b/>
+                <w:color w:val="1F4E79"/>
+                <w:sz w:val="20"/>
+              </w:rPr>
+              <w:t>Ambiti</w:t>
+            </w:r>
+          </w:p>
+          <w:p>
+            <w:r>
+              <w:rPr>
+                <w:rFonts w:ascii="Calibri" w:cs="Calibri" w:eastAsia="Calibri" w:hAnsi="Calibri"/>
+                <w:sz w:val="20"/>
+              </w:rPr>
+              <w:t>AI &amp; Threat Intel · Endpoint &amp; Identity · Cloud Security</w:t>
+            </w:r>
+          </w:p>
+        </w:tc>
+        <w:tc>
+          <w:tcPr>
+            <w:tcW w:type="dxa" w:w="2271"/>
+            <w:tcBorders>
+              <w:top w:val="single" w:color="C9C9C9" w:sz="1"/>
+              <w:left w:val="single" w:color="C9C9C9" w:sz="1"/>
+              <w:bottom w:val="single" w:color="C9C9C9" w:sz="1"/>
+              <w:right w:val="single" w:color="C9C9C9" w:sz="1"/>
+            </w:tcBorders>
+            <w:shd w:fill="DEEAF1" w:val="clear"/>
+            <w:tcMar>
+              <w:top w:type="dxa" w:w="80"/>
+              <w:left w:type="dxa" w:w="120"/>
+              <w:bottom w:type="dxa" w:w="80"/>
+              <w:right w:type="dxa" w:w="120"/>
+            </w:tcMar>
+          </w:tcPr>
+          <w:p>
+            <w:r>
+              <w:rPr>
+                <w:rFonts w:ascii="Calibri" w:cs="Calibri" w:eastAsia="Calibri" w:hAnsi="Calibri"/>
+                <w:b/>
+                <w:color w:val="1F4E79"/>
+                <w:sz w:val="20"/>
+              </w:rPr>
+              <w:t>Contesto chiave</w:t>
+            </w:r>
+          </w:p>
+          <w:p>
+            <w:r>
+              <w:rPr>
+                <w:rFonts w:ascii="Calibri" w:cs="Calibri" w:eastAsia="Calibri" w:hAnsi="Calibri"/>
+                <w:sz w:val="20"/>
+              </w:rPr>
+              <w:t>Scadenza ACN NIS2 30 giugno 2026 · AI agentiva per SOC · CNAPP runtime-first</w:t>
+            </w:r>
+          </w:p>
+        </w:tc>
+      </w:tr>
+    </w:tbl>
+    <w:p>
+      <w:pPr>
+        <w:spacing w:after="120" w:before="60"/>
+      </w:pPr>
+      <w:r>
+        <w:rPr>
+          <w:rFonts w:ascii="Calibri" w:cs="Calibri" w:eastAsia="Calibri" w:hAnsi="Calibri"/>
+          <w:i/>
+          <w:iCs/>
+          <w:color w:val="595959"/>
+          <w:sz w:val="20"/>
+        </w:rPr>
+        <w:t xml:space="preserve">Settimana segnata dalla scadenza ACN NIS2 del 30 giugno 2026 per la categorizzazione obbligatoria sulla piattaforma nazionale. La PA Centrale è sotto pressione per completare gli adempimenti. Sul piano tecnologico, si consolida il paradigma dell’AI agentiva applicata alle operazioni di sicurezza.</w:t>
+      </w:r>
+    </w:p>
+    <w:p>
+      <w:pPr>
+        <w:pStyle w:val="Heading2"/>
+      </w:pPr>
+      <w:r>
+        <w:rPr>
+          <w:rFonts w:ascii="Calibri" w:cs="Calibri" w:eastAsia="Calibri" w:hAnsi="Calibri"/>
+          <w:b/>
+          <w:color w:val="1F4E79"/>
+          <w:sz w:val="24"/>
+        </w:rPr>
+        <w:t>Scheda 1 — Censys Internet Intelligence Platform — SOC Ecosystem Integrations</w:t>
+      </w:r>
+    </w:p>
+    <w:tbl>
+      <w:tblPr>
+        <w:tblW w:type="dxa" w:w="9026"/>
+        <w:tblBorders>
+          <w:top w:val="single" w:color="1F4E79" w:sz="8"/>
+          <w:left w:val="none" w:sz="0"/>
+          <w:bottom w:val="single" w:color="C9C9C9" w:sz="2"/>
+          <w:right w:val="none" w:sz="0"/>
+          <w:insideH w:val="single" w:color="C9C9C9" w:sz="1"/>
+          <w:insideV w:val="none" w:sz="0"/>
+        </w:tblBorders>
+      </w:tblPr>
+      <w:tblGrid>
+        <w:gridCol w:w="2256"/>
+        <w:gridCol w:w="6770"/>
+      </w:tblGrid>
+      <w:tr>
+        <w:tc>
+          <w:tcPr>
+            <w:tcW w:type="dxa" w:w="2256"/>
+            <w:shd w:fill="1F4E79" w:val="clear"/>
+            <w:tcMar>
+              <w:top w:type="dxa" w:w="80"/>
+              <w:left w:type="dxa" w:w="120"/>
+              <w:bottom w:type="dxa" w:w="80"/>
+              <w:right w:type="dxa" w:w="120"/>
+            </w:tcMar>
+          </w:tcPr>
+          <w:p>
+            <w:r>
+              <w:rPr>
+                <w:rFonts w:ascii="Calibri" w:cs="Calibri" w:eastAsia="Calibri" w:hAnsi="Calibri"/>
+                <w:b/>
+                <w:color w:val="FFFFFF"/>
+                <w:sz w:val="20"/>
+              </w:rPr>
+              <w:t>Vendor / Data</w:t>
+            </w:r>
+          </w:p>
+        </w:tc>
+        <w:tc>
+          <w:tcPr>
+            <w:tcW w:type="dxa" w:w="6770"/>
+            <w:shd w:fill="DEEAF1" w:val="clear"/>
+            <w:tcMar>
+              <w:top w:type="dxa" w:w="80"/>
+              <w:left w:type="dxa" w:w="120"/>
+              <w:bottom w:type="dxa" w:w="80"/>
+              <w:right w:type="dxa" w:w="120"/>
+            </w:tcMar>
+          </w:tcPr>
+          <w:p>
+            <w:r>
+              <w:rPr>
+                <w:rFonts w:ascii="Calibri" w:cs="Calibri" w:eastAsia="Calibri" w:hAnsi="Calibri"/>
+                <w:sz w:val="20"/>
+              </w:rPr>
+              <w:t>Censys (USA) · Annuncio: 3 giugno 2026 · Ambito: AI &amp; Threat Intelligence</w:t>
+            </w:r>
+          </w:p>
+        </w:tc>
+      </w:tr>
+      <w:tr>
+        <w:tc>
+          <w:tcPr>
+            <w:tcW w:type="dxa" w:w="2256"/>
+            <w:shd w:fill="1F4E79" w:val="clear"/>
+            <w:tcMar>
+              <w:top w:type="dxa" w:w="80"/>
+              <w:left w:type="dxa" w:w="120"/>
+              <w:bottom w:type="dxa" w:w="80"/>
+              <w:right w:type="dxa" w:w="120"/>
+            </w:tcMar>
+          </w:tcPr>
+          <w:p>
+            <w:r>
+              <w:rPr>
+                <w:rFonts w:ascii="Calibri" w:cs="Calibri" w:eastAsia="Calibri" w:hAnsi="Calibri"/>
+                <w:b/>
+                <w:color w:val="FFFFFF"/>
+                <w:sz w:val="20"/>
+              </w:rPr>
+              <w:t>Cosa fa</w:t>
+            </w:r>
+          </w:p>
+        </w:tc>
+        <w:tc>
+          <w:tcPr>
+            <w:tcW w:type="dxa" w:w="6770"/>
+            <w:tcMar>
+              <w:top w:type="dxa" w:w="80"/>
+              <w:left w:type="dxa" w:w="120"/>
+              <w:bottom w:type="dxa" w:w="80"/>
+              <w:right w:type="dxa" w:w="120"/>
+            </w:tcMar>
+          </w:tcPr>
+          <w:p>
+            <w:r>
+              <w:rPr>
+                <w:rFonts w:ascii="Calibri" w:cs="Calibri" w:eastAsia="Calibri" w:hAnsi="Calibri"/>
+                <w:sz w:val="20"/>
+              </w:rPr>
+              <w:t>55+ integrazioni native con i principali stack SOC (Splunk, Microsoft Sentinel, Google SecOps, Palo Alto Cortex, OpenCTI, Dropzone AI). Porta l’intelligence sull’infrastruttura Internet globale — IP, domini, servizi, certificati — direttamente nei workflow operativi, con risk scoring automatico in tempo reale.</w:t>
+            </w:r>
+          </w:p>
+        </w:tc>
+      </w:tr>
+      <w:tr>
+        <w:tc>
+          <w:tcPr>
+            <w:tcW w:type="dxa" w:w="2256"/>
+            <w:shd w:fill="1F4E79" w:val="clear"/>
+            <w:tcMar>
+              <w:top w:type="dxa" w:w="80"/>
+              <w:left w:type="dxa" w:w="120"/>
+              <w:bottom w:type="dxa" w:w="80"/>
+              <w:right w:type="dxa" w:w="120"/>
+            </w:tcMar>
+          </w:tcPr>
+          <w:p>
+            <w:r>
+              <w:rPr>
+                <w:rFonts w:ascii="Calibri" w:cs="Calibri" w:eastAsia="Calibri" w:hAnsi="Calibri"/>
+                <w:b/>
+                <w:color w:val="FFFFFF"/>
+                <w:sz w:val="20"/>
+              </w:rPr>
+              <w:t>Infrastruttura</w:t>
+            </w:r>
+          </w:p>
+        </w:tc>
+        <w:tc>
+          <w:tcPr>
+            <w:tcW w:type="dxa" w:w="6770"/>
+            <w:shd w:fill="DEEAF1" w:val="clear"/>
+            <w:tcMar>
+              <w:top w:type="dxa" w:w="80"/>
+              <w:left w:type="dxa" w:w="120"/>
+              <w:bottom w:type="dxa" w:w="80"/>
+              <w:right w:type="dxa" w:w="120"/>
+            </w:tcMar>
+          </w:tcPr>
+          <w:p>
+            <w:r>
+              <w:rPr>
+                <w:rFonts w:ascii="Calibri" w:cs="Calibri" w:eastAsia="Calibri" w:hAnsi="Calibri"/>
+                <w:sz w:val="20"/>
+              </w:rPr>
+              <w:t>SaaS cloud-native, agentless. API REST + plugin nativi plug-and-play. 45+ technology alliance partner. Scanning proprietario continuo dell’infrastruttura Internet globale.</w:t>
+            </w:r>
+          </w:p>
+        </w:tc>
+      </w:tr>
+      <w:tr>
+        <w:tc>
+          <w:tcPr>
+            <w:tcW w:type="dxa" w:w="2256"/>
+            <w:shd w:fill="1F4E79" w:val="clear"/>
+            <w:tcMar>
+              <w:top w:type="dxa" w:w="80"/>
+              <w:left w:type="dxa" w:w="120"/>
+              <w:bottom w:type="dxa" w:w="80"/>
+              <w:right w:type="dxa" w:w="120"/>
+            </w:tcMar>
+          </w:tcPr>
+          <w:p>
+            <w:r>
+              <w:rPr>
+                <w:rFonts w:ascii="Calibri" w:cs="Calibri" w:eastAsia="Calibri" w:hAnsi="Calibri"/>
+                <w:b/>
+                <w:color w:val="FFFFFF"/>
+                <w:sz w:val="20"/>
+              </w:rPr>
+              <w:t>Rilevanza PA / NIS2</w:t>
+            </w:r>
+          </w:p>
+        </w:tc>
+        <w:tc>
+          <w:tcPr>
+            <w:tcW w:type="dxa" w:w="6770"/>
+            <w:tcMar>
+              <w:top w:type="dxa" w:w="80"/>
+              <w:left w:type="dxa" w:w="120"/>
+              <w:bottom w:type="dxa" w:w="80"/>
+              <w:right w:type="dxa" w:w="120"/>
+            </w:tcMar>
+          </w:tcPr>
+          <w:p>
+            <w:r>
+              <w:rPr>
+                <w:rFonts w:ascii="Calibri" w:cs="Calibri" w:eastAsia="Calibri" w:hAnsi="Calibri"/>
+                <w:sz w:val="20"/>
+              </w:rPr>
+              <w:t>Visibilità sugli asset Internet-facing (portali istituzionali, VPN gateway) accelera la compliance NIS2 Art. 21. Disponibile tramite MSSP partner italiani. Target: Enterprise e Mid-Market con SOC operativo.</w:t>
+            </w:r>
+          </w:p>
+        </w:tc>
+      </w:tr>
+    </w:tbl>
+    <w:p>
+      <w:pPr>
+        <w:spacing w:after="120" w:before="60"/>
+      </w:pPr>
+    </w:p>
+    <w:p>
+      <w:pPr>
+        <w:pStyle w:val="Heading2"/>
+      </w:pPr>
+      <w:r>
+        <w:rPr>
+          <w:rFonts w:ascii="Calibri" w:cs="Calibri" w:eastAsia="Calibri" w:hAnsi="Calibri"/>
+          <w:b/>
+          <w:color w:val="1F4E79"/>
+          <w:sz w:val="24"/>
+        </w:rPr>
+        <w:t>Scheda 2 — SentinelOne Purple AI — Agentic Investigations (GA)</w:t>
+      </w:r>
+    </w:p>
+    <w:tbl>
+      <w:tblPr>
+        <w:tblW w:type="dxa" w:w="9026"/>
+        <w:tblBorders>
+          <w:top w:val="single" w:color="1F4E79" w:sz="8"/>
+          <w:left w:val="none" w:sz="0"/>
+          <w:bottom w:val="single" w:color="C9C9C9" w:sz="2"/>
+          <w:right w:val="none" w:sz="0"/>
+          <w:insideH w:val="single" w:color="C9C9C9" w:sz="1"/>
+          <w:insideV w:val="none" w:sz="0"/>
+        </w:tblBorders>
+      </w:tblPr>
+      <w:tblGrid>
+        <w:gridCol w:w="2256"/>
+        <w:gridCol w:w="6770"/>
+      </w:tblGrid>
+      <w:tr>
+        <w:tc>
+          <w:tcPr>
+            <w:tcW w:type="dxa" w:w="2256"/>
+            <w:shd w:fill="1F4E79" w:val="clear"/>
+            <w:tcMar>
+              <w:top w:type="dxa" w:w="80"/>
+              <w:left w:type="dxa" w:w="120"/>
+              <w:bottom w:type="dxa" w:w="80"/>
+              <w:right w:type="dxa" w:w="120"/>
+            </w:tcMar>
+          </w:tcPr>
+          <w:p>
+            <w:r>
+              <w:rPr>
+                <w:rFonts w:ascii="Calibri" w:cs="Calibri" w:eastAsia="Calibri" w:hAnsi="Calibri"/>
+                <w:b/>
+                <w:color w:val="FFFFFF"/>
+                <w:sz w:val="20"/>
+              </w:rPr>
+              <w:t>Vendor / Data</w:t>
+            </w:r>
+          </w:p>
+        </w:tc>
+        <w:tc>
+          <w:tcPr>
+            <w:tcW w:type="dxa" w:w="6770"/>
+            <w:shd w:fill="DEEAF1" w:val="clear"/>
+            <w:tcMar>
+              <w:top w:type="dxa" w:w="80"/>
+              <w:left w:type="dxa" w:w="120"/>
+              <w:bottom w:type="dxa" w:w="80"/>
+              <w:right w:type="dxa" w:w="120"/>
+            </w:tcMar>
+          </w:tcPr>
+          <w:p>
+            <w:r>
+              <w:rPr>
+                <w:rFonts w:ascii="Calibri" w:cs="Calibri" w:eastAsia="Calibri" w:hAnsi="Calibri"/>
+                <w:sz w:val="20"/>
+              </w:rPr>
+              <w:t>SentinelOne (USA, NYSE:S) · GA: Q2 2026 · Ambito: Endpoint &amp; Identity / AI applicata alla difesa</w:t>
+            </w:r>
+          </w:p>
+        </w:tc>
+      </w:tr>
+      <w:tr>
+        <w:tc>
+          <w:tcPr>
+            <w:tcW w:type="dxa" w:w="2256"/>
+            <w:shd w:fill="1F4E79" w:val="clear"/>
+            <w:tcMar>
+              <w:top w:type="dxa" w:w="80"/>
+              <w:left w:type="dxa" w:w="120"/>
+              <w:bottom w:type="dxa" w:w="80"/>
+              <w:right w:type="dxa" w:w="120"/>
+            </w:tcMar>
+          </w:tcPr>
+          <w:p>
+            <w:r>
+              <w:rPr>
+                <w:rFonts w:ascii="Calibri" w:cs="Calibri" w:eastAsia="Calibri" w:hAnsi="Calibri"/>
+                <w:b/>
+                <w:color w:val="FFFFFF"/>
+                <w:sz w:val="20"/>
+              </w:rPr>
+              <w:t>Cosa fa</w:t>
+            </w:r>
+          </w:p>
+        </w:tc>
+        <w:tc>
+          <w:tcPr>
+            <w:tcW w:type="dxa" w:w="6770"/>
+            <w:tcMar>
+              <w:top w:type="dxa" w:w="80"/>
+              <w:left w:type="dxa" w:w="120"/>
+              <w:bottom w:type="dxa" w:w="80"/>
+              <w:right w:type="dxa" w:w="120"/>
+            </w:tcMar>
+          </w:tcPr>
+          <w:p>
+            <w:r>
+              <w:rPr>
+                <w:rFonts w:ascii="Calibri" w:cs="Calibri" w:eastAsia="Calibri" w:hAnsi="Calibri"/>
+                <w:sz w:val="20"/>
+              </w:rPr>
+              <w:t>Indagine forense completa avviata con un singolo click. Purple AI raccoglie autonomamente evidenze cross-stack (endpoint, identity, rete, cloud), ricostruisce la timeline dell’attacco in linguaggio naturale e propone remediation via Singularity Hyperautomation. Riduce il rumore di ingestion fino all’80% nei log. Attach rate: oltre 50% di tutte le licenze S1 vendute in Q4 FY2026.</w:t>
+            </w:r>
+          </w:p>
+        </w:tc>
+      </w:tr>
+      <w:tr>
+        <w:tc>
+          <w:tcPr>
+            <w:tcW w:type="dxa" w:w="2256"/>
+            <w:shd w:fill="1F4E79" w:val="clear"/>
+            <w:tcMar>
+              <w:top w:type="dxa" w:w="80"/>
+              <w:left w:type="dxa" w:w="120"/>
+              <w:bottom w:type="dxa" w:w="80"/>
+              <w:right w:type="dxa" w:w="120"/>
+            </w:tcMar>
+          </w:tcPr>
+          <w:p>
+            <w:r>
+              <w:rPr>
+                <w:rFonts w:ascii="Calibri" w:cs="Calibri" w:eastAsia="Calibri" w:hAnsi="Calibri"/>
+                <w:b/>
+                <w:color w:val="FFFFFF"/>
+                <w:sz w:val="20"/>
+              </w:rPr>
+              <w:t>Infrastruttura</w:t>
+            </w:r>
+          </w:p>
+        </w:tc>
+        <w:tc>
+          <w:tcPr>
+            <w:tcW w:type="dxa" w:w="6770"/>
+            <w:shd w:fill="DEEAF1" w:val="clear"/>
+            <w:tcMar>
+              <w:top w:type="dxa" w:w="80"/>
+              <w:left w:type="dxa" w:w="120"/>
+              <w:bottom w:type="dxa" w:w="80"/>
+              <w:right w:type="dxa" w:w="120"/>
+            </w:tcMar>
+          </w:tcPr>
+          <w:p>
+            <w:r>
+              <w:rPr>
+                <w:rFonts w:ascii="Calibri" w:cs="Calibri" w:eastAsia="Calibri" w:hAnsi="Calibri"/>
+                <w:sz w:val="20"/>
+              </w:rPr>
+              <w:t>Singularity Platform: SaaS cloud-native + on-premise per ambienti regolamentati e air-gapped. Agent-based (Singularity sensor) per endpoint; agentless per cloud/identity. Supporto ambienti isolati: differenziatore chiave per PA e PSNC.</w:t>
+            </w:r>
+          </w:p>
+        </w:tc>
+      </w:tr>
+      <w:tr>
+        <w:tc>
+          <w:tcPr>
+            <w:tcW w:type="dxa" w:w="2256"/>
+            <w:shd w:fill="1F4E79" w:val="clear"/>
+            <w:tcMar>
+              <w:top w:type="dxa" w:w="80"/>
+              <w:left w:type="dxa" w:w="120"/>
+              <w:bottom w:type="dxa" w:w="80"/>
+              <w:right w:type="dxa" w:w="120"/>
+            </w:tcMar>
+          </w:tcPr>
+          <w:p>
+            <w:r>
+              <w:rPr>
+                <w:rFonts w:ascii="Calibri" w:cs="Calibri" w:eastAsia="Calibri" w:hAnsi="Calibri"/>
+                <w:b/>
+                <w:color w:val="FFFFFF"/>
+                <w:sz w:val="20"/>
+              </w:rPr>
+              <w:t>Rilevanza PA / NIS2</w:t>
+            </w:r>
+          </w:p>
+        </w:tc>
+        <w:tc>
+          <w:tcPr>
+            <w:tcW w:type="dxa" w:w="6770"/>
+            <w:tcMar>
+              <w:top w:type="dxa" w:w="80"/>
+              <w:left w:type="dxa" w:w="120"/>
+              <w:bottom w:type="dxa" w:w="80"/>
+              <w:right w:type="dxa" w:w="120"/>
+            </w:tcMar>
+          </w:tcPr>
+          <w:p>
+            <w:r>
+              <w:rPr>
+                <w:rFonts w:ascii="Calibri" w:cs="Calibri" w:eastAsia="Calibri" w:hAnsi="Calibri"/>
+                <w:sz w:val="20"/>
+              </w:rPr>
+              <w:t>Supporto on-premise e air-gapped fondamentale per sistemi PSNC. Riduzione 80% rumore log allineata a NIS2 Art. 21 (logging e monitoraggio). Automatizza il triage per SOC sotto-dimensionati, problema comune nella PA italiana.</w:t>
+            </w:r>
+          </w:p>
+        </w:tc>
+      </w:tr>
+    </w:tbl>
+    <w:p>
+      <w:pPr>
+        <w:spacing w:after="120" w:before="60"/>
+      </w:pPr>
+    </w:p>
+    <w:p>
+      <w:pPr>
+        <w:pStyle w:val="Heading2"/>
+      </w:pPr>
+      <w:r>
+        <w:rPr>
+          <w:rFonts w:ascii="Calibri" w:cs="Calibri" w:eastAsia="Calibri" w:hAnsi="Calibri"/>
+          <w:b/>
+          <w:color w:val="1F4E79"/>
+          <w:sz w:val="24"/>
+        </w:rPr>
+        <w:t>Scheda 3 — Sysdig CNAPP — Leader Forrester Wave Q1 2026 (Runtime-First)</w:t>
+      </w:r>
+    </w:p>
+    <w:tbl>
+      <w:tblPr>
+        <w:tblW w:type="dxa" w:w="9026"/>
+        <w:tblBorders>
+          <w:top w:val="single" w:color="1F4E79" w:sz="8"/>
+          <w:left w:val="none" w:sz="0"/>
+          <w:bottom w:val="single" w:color="C9C9C9" w:sz="2"/>
+          <w:right w:val="none" w:sz="0"/>
+          <w:insideH w:val="single" w:color="C9C9C9" w:sz="1"/>
+          <w:insideV w:val="none" w:sz="0"/>
+        </w:tblBorders>
+      </w:tblPr>
+      <w:tblGrid>
+        <w:gridCol w:w="2256"/>
+        <w:gridCol w:w="6770"/>
+      </w:tblGrid>
+      <w:tr>
+        <w:tc>
+          <w:tcPr>
+            <w:tcW w:type="dxa" w:w="2256"/>
+            <w:shd w:fill="1F4E79" w:val="clear"/>
+            <w:tcMar>
+              <w:top w:type="dxa" w:w="80"/>
+              <w:left w:type="dxa" w:w="120"/>
+              <w:bottom w:type="dxa" w:w="80"/>
+              <w:right w:type="dxa" w:w="120"/>
+            </w:tcMar>
+          </w:tcPr>
+          <w:p>
+            <w:r>
+              <w:rPr>
+                <w:rFonts w:ascii="Calibri" w:cs="Calibri" w:eastAsia="Calibri" w:hAnsi="Calibri"/>
+                <w:b/>
+                <w:color w:val="FFFFFF"/>
+                <w:sz w:val="20"/>
+              </w:rPr>
+              <w:t>Vendor / Data</w:t>
+            </w:r>
+          </w:p>
+        </w:tc>
+        <w:tc>
+          <w:tcPr>
+            <w:tcW w:type="dxa" w:w="6770"/>
+            <w:shd w:fill="DEEAF1" w:val="clear"/>
+            <w:tcMar>
+              <w:top w:type="dxa" w:w="80"/>
+              <w:left w:type="dxa" w:w="120"/>
+              <w:bottom w:type="dxa" w:w="80"/>
+              <w:right w:type="dxa" w:w="120"/>
+            </w:tcMar>
+          </w:tcPr>
+          <w:p>
+            <w:r>
+              <w:rPr>
+                <w:rFonts w:ascii="Calibri" w:cs="Calibri" w:eastAsia="Calibri" w:hAnsi="Calibri"/>
+                <w:sz w:val="20"/>
+              </w:rPr>
+              <w:t>Sysdig (USA, 2013) · Forrester Wave Leader Q1 2026 · Ambito: Cloud &amp; Infrastructure Security (CNAPP)</w:t>
+            </w:r>
+          </w:p>
+        </w:tc>
+      </w:tr>
+      <w:tr>
+        <w:tc>
+          <w:tcPr>
+            <w:tcW w:type="dxa" w:w="2256"/>
+            <w:shd w:fill="1F4E79" w:val="clear"/>
+            <w:tcMar>
+              <w:top w:type="dxa" w:w="80"/>
+              <w:left w:type="dxa" w:w="120"/>
+              <w:bottom w:type="dxa" w:w="80"/>
+              <w:right w:type="dxa" w:w="120"/>
+            </w:tcMar>
+          </w:tcPr>
+          <w:p>
+            <w:r>
+              <w:rPr>
+                <w:rFonts w:ascii="Calibri" w:cs="Calibri" w:eastAsia="Calibri" w:hAnsi="Calibri"/>
+                <w:b/>
+                <w:color w:val="FFFFFF"/>
+                <w:sz w:val="20"/>
+              </w:rPr>
+              <w:t>Cosa fa</w:t>
+            </w:r>
+          </w:p>
+        </w:tc>
+        <w:tc>
+          <w:tcPr>
+            <w:tcW w:type="dxa" w:w="6770"/>
+            <w:tcMar>
+              <w:top w:type="dxa" w:w="80"/>
+              <w:left w:type="dxa" w:w="120"/>
+              <w:bottom w:type="dxa" w:w="80"/>
+              <w:right w:type="dxa" w:w="120"/>
+            </w:tcMar>
+          </w:tcPr>
+          <w:p>
+            <w:r>
+              <w:rPr>
+                <w:rFonts w:ascii="Calibri" w:cs="Calibri" w:eastAsia="Calibri" w:hAnsi="Calibri"/>
+                <w:sz w:val="20"/>
+              </w:rPr>
+              <w:t>CNAPP runtime-first: correla visibilità runtime (eBPF/Falco) con posture management, vulnerability e CIEM per identificare solo i rischi reali. Sysdig Sage AI riduce MTTR del 76% e recupera 80+ ore/settimana di triage manuale. Uno dei soli 3 Leader (su 14 valutati) nella Forrester Wave CNAPP Q1 2026.</w:t>
+            </w:r>
+          </w:p>
+        </w:tc>
+      </w:tr>
+      <w:tr>
+        <w:tc>
+          <w:tcPr>
+            <w:tcW w:type="dxa" w:w="2256"/>
+            <w:shd w:fill="1F4E79" w:val="clear"/>
+            <w:tcMar>
+              <w:top w:type="dxa" w:w="80"/>
+              <w:left w:type="dxa" w:w="120"/>
+              <w:bottom w:type="dxa" w:w="80"/>
+              <w:right w:type="dxa" w:w="120"/>
+            </w:tcMar>
+          </w:tcPr>
+          <w:p>
+            <w:r>
+              <w:rPr>
+                <w:rFonts w:ascii="Calibri" w:cs="Calibri" w:eastAsia="Calibri" w:hAnsi="Calibri"/>
+                <w:b/>
+                <w:color w:val="FFFFFF"/>
+                <w:sz w:val="20"/>
+              </w:rPr>
+              <w:t>Infrastruttura</w:t>
+            </w:r>
+          </w:p>
+        </w:tc>
+        <w:tc>
+          <w:tcPr>
+            <w:tcW w:type="dxa" w:w="6770"/>
+            <w:shd w:fill="DEEAF1" w:val="clear"/>
+            <w:tcMar>
+              <w:top w:type="dxa" w:w="80"/>
+              <w:left w:type="dxa" w:w="120"/>
+              <w:bottom w:type="dxa" w:w="80"/>
+              <w:right w:type="dxa" w:w="120"/>
+            </w:tcMar>
+          </w:tcPr>
+          <w:p>
+            <w:r>
+              <w:rPr>
+                <w:rFonts w:ascii="Calibri" w:cs="Calibri" w:eastAsia="Calibri" w:hAnsi="Calibri"/>
+                <w:sz w:val="20"/>
+              </w:rPr>
+              <w:t>SaaS multi-cloud (AWS, Azure, GCP). Agent eBPF ultra-leggero per runtime. Integrazioni CI/CD, registry container, Splunk, ServiceNow, Jira. Opzione on-premise per data residency EU. Deployabile su cloud qualificati ACN (AWS, Azure qualificate per PA).</w:t>
+            </w:r>
+          </w:p>
+        </w:tc>
+      </w:tr>
+      <w:tr>
+        <w:tc>
+          <w:tcPr>
+            <w:tcW w:type="dxa" w:w="2256"/>
+            <w:shd w:fill="1F4E79" w:val="clear"/>
+            <w:tcMar>
+              <w:top w:type="dxa" w:w="80"/>
+              <w:left w:type="dxa" w:w="120"/>
+              <w:bottom w:type="dxa" w:w="80"/>
+              <w:right w:type="dxa" w:w="120"/>
+            </w:tcMar>
+          </w:tcPr>
+          <w:p>
+            <w:r>
+              <w:rPr>
+                <w:rFonts w:ascii="Calibri" w:cs="Calibri" w:eastAsia="Calibri" w:hAnsi="Calibri"/>
+                <w:b/>
+                <w:color w:val="FFFFFF"/>
+                <w:sz w:val="20"/>
+              </w:rPr>
+              <w:t>Rilevanza PA / NIS2</w:t>
+            </w:r>
+          </w:p>
+        </w:tc>
+        <w:tc>
+          <w:tcPr>
+            <w:tcW w:type="dxa" w:w="6770"/>
+            <w:tcMar>
+              <w:top w:type="dxa" w:w="80"/>
+              <w:left w:type="dxa" w:w="120"/>
+              <w:bottom w:type="dxa" w:w="80"/>
+              <w:right w:type="dxa" w:w="120"/>
+            </w:tcMar>
+          </w:tcPr>
+          <w:p>
+            <w:r>
+              <w:rPr>
+                <w:rFonts w:ascii="Calibri" w:cs="Calibri" w:eastAsia="Calibri" w:hAnsi="Calibri"/>
+                <w:sz w:val="20"/>
+              </w:rPr>
+              <w:t>Risponde direttamente a NIS2 Art. 21 (vulnerability management, monitoraggio asset cloud, controllo configurazioni). Forrester Wave Q1 2026: riferimento analitico indipendente per valutazione vendor in gare pubbliche (Codice dei Contratti). Deployabile su Cloud di Qualificazione ACN.</w:t>
+            </w:r>
+          </w:p>
+        </w:tc>
+      </w:tr>
+    </w:tbl>
+    <w:p>
+      <w:pPr>
+        <w:spacing w:after="120" w:before="60"/>
+      </w:pPr>
+    </w:p>
+    <w:p>
+      <w:pPr>
+        <w:pStyle w:val="Heading2"/>
+      </w:pPr>
+      <w:r>
+        <w:rPr>
+          <w:rFonts w:ascii="Calibri" w:cs="Calibri" w:eastAsia="Calibri" w:hAnsi="Calibri"/>
+          <w:b/>
+          <w:color w:val="1F4E79"/>
+          <w:sz w:val="24"/>
+        </w:rPr>
+        <w:t>Segnali dal mercato</w:t>
+      </w:r>
+    </w:p>
+    <w:tbl>
+      <w:tblPr>
+        <w:tblW w:type="dxa" w:w="9026"/>
+        <w:tblBorders>
+          <w:top w:val="single" w:color="1F4E79" w:sz="8"/>
+          <w:left w:val="none" w:sz="0"/>
+          <w:bottom w:val="single" w:color="C9C9C9" w:sz="2"/>
+          <w:right w:val="none" w:sz="0"/>
+          <w:insideH w:val="single" w:color="C9C9C9" w:sz="1"/>
+          <w:insideV w:val="none" w:sz="0"/>
+        </w:tblBorders>
+      </w:tblPr>
+      <w:tblGrid>
+        <w:gridCol w:w="3010"/>
+        <w:gridCol w:w="6016"/>
+      </w:tblGrid>
+      <w:tr>
+        <w:tc>
+          <w:tcPr>
+            <w:tcW w:type="dxa" w:w="3010"/>
+            <w:shd w:fill="1F4E79" w:val="clear"/>
+            <w:tcMar>
+              <w:top w:type="dxa" w:w="80"/>
+              <w:left w:type="dxa" w:w="120"/>
+              <w:bottom w:type="dxa" w:w="80"/>
+              <w:right w:type="dxa" w:w="120"/>
+            </w:tcMar>
+          </w:tcPr>
+          <w:p>
+            <w:r>
+              <w:rPr>
+                <w:rFonts w:ascii="Calibri" w:cs="Calibri" w:eastAsia="Calibri" w:hAnsi="Calibri"/>
+                <w:b/>
+                <w:color w:val="FFFFFF"/>
+                <w:sz w:val="20"/>
+              </w:rPr>
+              <w:t>Segnale</w:t>
+            </w:r>
+          </w:p>
+        </w:tc>
+        <w:tc>
+          <w:tcPr>
+            <w:tcW w:type="dxa" w:w="6016"/>
+            <w:shd w:fill="1F4E79" w:val="clear"/>
+            <w:tcMar>
+              <w:top w:type="dxa" w:w="80"/>
+              <w:left w:type="dxa" w:w="120"/>
+              <w:bottom w:type="dxa" w:w="80"/>
+              <w:right w:type="dxa" w:w="120"/>
+            </w:tcMar>
+          </w:tcPr>
+          <w:p>
+            <w:r>
+              <w:rPr>
+                <w:rFonts w:ascii="Calibri" w:cs="Calibri" w:eastAsia="Calibri" w:hAnsi="Calibri"/>
+                <w:b/>
+                <w:color w:val="FFFFFF"/>
+                <w:sz w:val="20"/>
+              </w:rPr>
+              <w:t>Rilevanza</w:t>
+            </w:r>
+          </w:p>
+        </w:tc>
+      </w:tr>
+      <w:tr>
+        <w:tc>
+          <w:tcPr>
+            <w:tcW w:type="dxa" w:w="3010"/>
+            <w:shd w:fill="DEEAF1" w:val="clear"/>
+            <w:tcMar>
+              <w:top w:type="dxa" w:w="80"/>
+              <w:left w:type="dxa" w:w="120"/>
+              <w:bottom w:type="dxa" w:w="80"/>
+              <w:right w:type="dxa" w:w="120"/>
+            </w:tcMar>
+          </w:tcPr>
+          <w:p>
+            <w:r>
+              <w:rPr>
+                <w:rFonts w:ascii="Calibri" w:cs="Calibri" w:eastAsia="Calibri" w:hAnsi="Calibri"/>
+                <w:b/>
+                <w:sz w:val="20"/>
+              </w:rPr>
+              <w:t>Scadenza ACN NIS2 — 30 giugno 2026</w:t>
+            </w:r>
+          </w:p>
+        </w:tc>
+        <w:tc>
+          <w:tcPr>
+            <w:tcW w:type="dxa" w:w="6016"/>
+            <w:tcMar>
+              <w:top w:type="dxa" w:w="80"/>
+              <w:left w:type="dxa" w:w="120"/>
+              <w:bottom w:type="dxa" w:w="80"/>
+              <w:right w:type="dxa" w:w="120"/>
+            </w:tcMar>
+          </w:tcPr>
+          <w:p>
+            <w:r>
+              <w:rPr>
+                <w:rFonts w:ascii="Calibri" w:cs="Calibri" w:eastAsia="Calibri" w:hAnsi="Calibri"/>
+                <w:sz w:val="20"/>
+              </w:rPr>
+              <w:t>Categorizzazione attività/servizi obbligatoria sulla piattaforma ACN (determina 155238/2026). Chi non adempie rischia sanzioni e ritardi nella certificazione. Riguarda tutte le PA Centrali nel perimetro NIS2.</w:t>
+            </w:r>
+          </w:p>
+        </w:tc>
+      </w:tr>
+      <w:tr>
+        <w:tc>
+          <w:tcPr>
+            <w:tcW w:type="dxa" w:w="3010"/>
+            <w:shd w:fill="DEEAF1" w:val="clear"/>
+            <w:tcMar>
+              <w:top w:type="dxa" w:w="80"/>
+              <w:left w:type="dxa" w:w="120"/>
+              <w:bottom w:type="dxa" w:w="80"/>
+              <w:right w:type="dxa" w:w="120"/>
+            </w:tcMar>
+          </w:tcPr>
+          <w:p>
+            <w:r>
+              <w:rPr>
+                <w:rFonts w:ascii="Calibri" w:cs="Calibri" w:eastAsia="Calibri" w:hAnsi="Calibri"/>
+                <w:b/>
+                <w:sz w:val="20"/>
+              </w:rPr>
+              <w:t>Dragos 2026 OT Report: +49% ransomware ICS</w:t>
+            </w:r>
+          </w:p>
+        </w:tc>
+        <w:tc>
+          <w:tcPr>
+            <w:tcW w:type="dxa" w:w="6016"/>
+            <w:tcMar>
+              <w:top w:type="dxa" w:w="80"/>
+              <w:left w:type="dxa" w:w="120"/>
+              <w:bottom w:type="dxa" w:w="80"/>
+              <w:right w:type="dxa" w:w="120"/>
+            </w:tcMar>
+          </w:tcPr>
+          <w:p>
+            <w:r>
+              <w:rPr>
+                <w:rFonts w:ascii="Calibri" w:cs="Calibri" w:eastAsia="Calibri" w:hAnsi="Calibri"/>
+                <w:sz w:val="20"/>
+              </w:rPr>
+              <w:t>3 nuovi threat group identificati (2 già dentro reti OT, Stage 2). 3.300 organizzazioni colpite da ransomware industriale (+49% YoY). Lacuna visibilità critica nelle reti OT italiane (energia, sanità).</w:t>
+            </w:r>
+          </w:p>
+        </w:tc>
+      </w:tr>
+      <w:tr>
+        <w:tc>
+          <w:tcPr>
+            <w:tcW w:type="dxa" w:w="3010"/>
+            <w:shd w:fill="DEEAF1" w:val="clear"/>
+            <w:tcMar>
+              <w:top w:type="dxa" w:w="80"/>
+              <w:left w:type="dxa" w:w="120"/>
+              <w:bottom w:type="dxa" w:w="80"/>
+              <w:right w:type="dxa" w:w="120"/>
+            </w:tcMar>
+          </w:tcPr>
+          <w:p>
+            <w:r>
+              <w:rPr>
+                <w:rFonts w:ascii="Calibri" w:cs="Calibri" w:eastAsia="Calibri" w:hAnsi="Calibri"/>
+                <w:b/>
+                <w:sz w:val="20"/>
+              </w:rPr>
+              <w:t>Illumio: Gartner Customers’ Choice Microsegmentation 2026</w:t>
+            </w:r>
+          </w:p>
+        </w:tc>
+        <w:tc>
+          <w:tcPr>
+            <w:tcW w:type="dxa" w:w="6016"/>
+            <w:tcMar>
+              <w:top w:type="dxa" w:w="80"/>
+              <w:left w:type="dxa" w:w="120"/>
+              <w:bottom w:type="dxa" w:w="80"/>
+              <w:right w:type="dxa" w:w="120"/>
+            </w:tcMar>
+          </w:tcPr>
+          <w:p>
+            <w:r>
+              <w:rPr>
+                <w:rFonts w:ascii="Calibri" w:cs="Calibri" w:eastAsia="Calibri" w:hAnsi="Calibri"/>
+                <w:sz w:val="20"/>
+              </w:rPr>
+              <w:t>Illumio conferma leadership nella microsegmentazione. Tecnologia sempre più rilevante per PA e infrastrutture critiche che devono limitare il lateral movement secondo i principi Zero Trust.</w:t>
+            </w:r>
+          </w:p>
+        </w:tc>
+      </w:tr>
+      <w:tr>
+        <w:tc>
+          <w:tcPr>
+            <w:tcW w:type="dxa" w:w="3010"/>
+            <w:shd w:fill="DEEAF1" w:val="clear"/>
+            <w:tcMar>
+              <w:top w:type="dxa" w:w="80"/>
+              <w:left w:type="dxa" w:w="120"/>
+              <w:bottom w:type="dxa" w:w="80"/>
+              <w:right w:type="dxa" w:w="120"/>
+            </w:tcMar>
+          </w:tcPr>
+          <w:p>
+            <w:r>
+              <w:rPr>
+                <w:rFonts w:ascii="Calibri" w:cs="Calibri" w:eastAsia="Calibri" w:hAnsi="Calibri"/>
+                <w:b/>
+                <w:sz w:val="20"/>
+              </w:rPr>
+              <w:t>Gartner: 60% SIEM+SOAR convergerà in piattaforme unificate entro 2026</w:t>
+            </w:r>
+          </w:p>
+        </w:tc>
+        <w:tc>
+          <w:tcPr>
+            <w:tcW w:type="dxa" w:w="6016"/>
+            <w:tcMar>
+              <w:top w:type="dxa" w:w="80"/>
+              <w:left w:type="dxa" w:w="120"/>
+              <w:bottom w:type="dxa" w:w="80"/>
+              <w:right w:type="dxa" w:w="120"/>
+            </w:tcMar>
+          </w:tcPr>
+          <w:p>
+            <w:r>
+              <w:rPr>
+                <w:rFonts w:ascii="Calibri" w:cs="Calibri" w:eastAsia="Calibri" w:hAnsi="Calibri"/>
+                <w:sz w:val="20"/>
+              </w:rPr>
+              <w:t>CrowdStrike Falcon Next-Gen SIEM e Palo Alto Cortex XSIAM guidano la convergenza. Chi ha SIEM tradizionale (Splunk standalone, IBM QRadar) deve pianificare la roadmap di aggiornamento.</w:t>
+            </w:r>
+          </w:p>
+        </w:tc>
+      </w:tr>
+    </w:tbl>
+    <w:p>
+      <w:pPr>
+        <w:pBdr>
+          <w:bottom w:val="single" w:color="1F4E79" w:sz="6" w:space="1"/>
+        </w:pBdr>
+        <w:spacing w:after="120" w:before="120"/>
+      </w:pPr>
+      <w:r>
+        <w:rPr>
+          <w:rFonts w:ascii="Calibri" w:cs="Calibri" w:eastAsia="Calibri" w:hAnsi="Calibri"/>
+          <w:i/>
+          <w:color w:val="595959"/>
+          <w:sz w:val="18"/>
+        </w:rPr>
+        <w:t xml:space="preserve">Prossimo briefing: 21 giugno 2026  ·  Generato automaticamente da Claude  ·  Cowork</w:t>
+      </w:r>
     </w:p>
     <w:p>
       <w:r>

</xml_diff>